<commit_message>
Adicionando Diagrama de Solução na Documentação
</commit_message>
<xml_diff>
--- a/Documentação_Rocket_League.docx
+++ b/Documentação_Rocket_League.docx
@@ -1,6 +1,6 @@
 
 <file path=word/document.xml><?xml version="1.0" encoding="utf-8"?>
-<w:document xmlns:wp14="http://schemas.microsoft.com/office/word/2010/wordprocessingDrawing" xmlns:mc="http://schemas.openxmlformats.org/markup-compatibility/2006" xmlns:o="urn:schemas-microsoft-com:office:office" xmlns:r="http://schemas.openxmlformats.org/officeDocument/2006/relationships" xmlns:m="http://schemas.openxmlformats.org/officeDocument/2006/math" xmlns:v="urn:schemas-microsoft-com:vml" xmlns:wp="http://schemas.openxmlformats.org/drawingml/2006/wordprocessingDrawing" xmlns:w10="urn:schemas-microsoft-com:office:word" xmlns:w="http://schemas.openxmlformats.org/wordprocessingml/2006/main" xmlns:wne="http://schemas.microsoft.com/office/word/2006/wordml" xmlns:sl="http://schemas.openxmlformats.org/schemaLibrary/2006/main" xmlns:a="http://schemas.openxmlformats.org/drawingml/2006/main" xmlns:pic="http://schemas.openxmlformats.org/drawingml/2006/picture" xmlns:c="http://schemas.openxmlformats.org/drawingml/2006/chart" xmlns:lc="http://schemas.openxmlformats.org/drawingml/2006/lockedCanvas" xmlns:dgm="http://schemas.openxmlformats.org/drawingml/2006/diagram" xmlns:wps="http://schemas.microsoft.com/office/word/2010/wordprocessingShape" xmlns:wpg="http://schemas.microsoft.com/office/word/2010/wordprocessingGroup" xmlns:w14="http://schemas.microsoft.com/office/word/2010/wordml" xmlns:w15="http://schemas.microsoft.com/office/word/2012/wordml" xmlns:w16="http://schemas.microsoft.com/office/word/2018/wordml" xmlns:w16cex="http://schemas.microsoft.com/office/word/2018/wordml/cex" xmlns:w16cid="http://schemas.microsoft.com/office/word/2016/wordml/cid" xmlns="http://schemas.microsoft.com/office/tasks/2019/documenttasks" xmlns:cr="http://schemas.microsoft.com/office/comments/2020/reactions" mc:Ignorable="wp14">
+<w:document xmlns:wp14="http://schemas.microsoft.com/office/word/2010/wordprocessingDrawing" xmlns:mc="http://schemas.openxmlformats.org/markup-compatibility/2006" xmlns:o="urn:schemas-microsoft-com:office:office" xmlns:r="http://schemas.openxmlformats.org/officeDocument/2006/relationships" xmlns:m="http://schemas.openxmlformats.org/officeDocument/2006/math" xmlns:v="urn:schemas-microsoft-com:vml" xmlns:wp="http://schemas.openxmlformats.org/drawingml/2006/wordprocessingDrawing" xmlns:w10="urn:schemas-microsoft-com:office:word" xmlns:w="http://schemas.openxmlformats.org/wordprocessingml/2006/main" xmlns:wne="http://schemas.microsoft.com/office/word/2006/wordml" xmlns:sl="http://schemas.openxmlformats.org/schemaLibrary/2006/main" xmlns:a="http://schemas.openxmlformats.org/drawingml/2006/main" xmlns:pic="http://schemas.openxmlformats.org/drawingml/2006/picture" xmlns:c="http://schemas.openxmlformats.org/drawingml/2006/chart" xmlns:lc="http://schemas.openxmlformats.org/drawingml/2006/lockedCanvas" xmlns:dgm="http://schemas.openxmlformats.org/drawingml/2006/diagram" xmlns:wps="http://schemas.microsoft.com/office/word/2010/wordprocessingShape" xmlns:wpg="http://schemas.microsoft.com/office/word/2010/wordprocessingGroup" xmlns:w14="http://schemas.microsoft.com/office/word/2010/wordml" xmlns:w15="http://schemas.microsoft.com/office/word/2012/wordml" xmlns:w16="http://schemas.microsoft.com/office/word/2018/wordml" xmlns:w16cex="http://schemas.microsoft.com/office/word/2018/wordml/cex" xmlns:w16cid="http://schemas.microsoft.com/office/word/2016/wordml/cid" xmlns="http://schemas.microsoft.com/office/tasks/2019/documenttasks" xmlns:cr="http://schemas.microsoft.com/office/comments/2020/reactions" xmlns:a14="http://schemas.microsoft.com/office/drawing/2010/main" mc:Ignorable="wp14">
   <w:body>
     <w:p xmlns:wp14="http://schemas.microsoft.com/office/word/2010/wordml" wp14:textId="77777777">
       <w:pPr>
@@ -547,6 +547,56 @@
         <w:t>Além disso, a evolução dentro do jogo é muito perceptível. No início, tarefas simples são difíceis, mas com prática é possível desenvolver habilidades mais avançadas. Isso fez com que eu passasse a enxergar o jogo não apenas como diversão, mas também como um ambiente de aprendizado.</w:t>
       </w:r>
     </w:p>
+    <w:p>
+      <w:pPr>
+        <w:pStyle w:val="Normal"/>
+        <w:spacing w:before="240" w:after="240"/>
+        <w:jc w:val="center"/>
+      </w:pPr>
+      <w:r>
+        <w:drawing>
+          <wp:inline wp14:editId="455B41F5" wp14:anchorId="28369A67">
+            <wp:extent cx="4495800" cy="2057400"/>
+            <wp:effectExtent l="0" t="0" r="0" b="0"/>
+            <wp:docPr id="1764023550" name="drawing"/>
+            <wp:cNvGraphicFramePr>
+              <a:graphicFrameLocks noChangeAspect="1"/>
+            </wp:cNvGraphicFramePr>
+            <a:graphic>
+              <a:graphicData xmlns:a="http://schemas.openxmlformats.org/drawingml/2006/main" uri="http://schemas.openxmlformats.org/drawingml/2006/picture">
+                <pic:pic xmlns:pic="http://schemas.openxmlformats.org/drawingml/2006/picture">
+                  <pic:nvPicPr>
+                    <pic:cNvPr id="1764023550" name="Picture 1764023550"/>
+                    <pic:cNvPicPr/>
+                  </pic:nvPicPr>
+                  <pic:blipFill>
+                    <a:blip xmlns:r="http://schemas.openxmlformats.org/officeDocument/2006/relationships" r:embed="rId1604426357">
+                      <a:extLst>
+                        <a:ext uri="{28A0092B-C50C-407E-A947-70E740481C1C}">
+                          <a14:useLocalDpi xmlns:a14="http://schemas.microsoft.com/office/drawing/2010/main"/>
+                        </a:ext>
+                      </a:extLst>
+                    </a:blip>
+                    <a:stretch>
+                      <a:fillRect/>
+                    </a:stretch>
+                  </pic:blipFill>
+                  <pic:spPr>
+                    <a:xfrm>
+                      <a:off x="0" y="0"/>
+                      <a:ext cx="4495800" cy="2057400"/>
+                    </a:xfrm>
+                    <a:prstGeom prst="rect">
+                      <a:avLst/>
+                    </a:prstGeom>
+                  </pic:spPr>
+                </pic:pic>
+              </a:graphicData>
+            </a:graphic>
+          </wp:inline>
+        </w:drawing>
+      </w:r>
+    </w:p>
     <w:p xmlns:wp14="http://schemas.microsoft.com/office/word/2010/wordml" wp14:textId="77777777">
       <w:pPr>
         <w:pStyle w:val="Heading1"/>
@@ -586,6 +636,56 @@
         <w:t xml:space="preserve"> sobre Rocket League, conteúdo explicativo sobre o jogo, um sistema de quiz dividido por dificuldade para testar o conhecimento do usuário, armazenamento das respostas em um banco de dados MySQL e exibição dos dados coletados em uma dashboard estática no site, além de estilizações especificas em modelos 3D dos carros com recompensas por nível alcançado ao concluir os quizes.</w:t>
       </w:r>
     </w:p>
+    <w:p>
+      <w:pPr>
+        <w:pStyle w:val="Normal"/>
+        <w:spacing w:before="240" w:after="240"/>
+        <w:jc w:val="center"/>
+      </w:pPr>
+      <w:r>
+        <w:drawing>
+          <wp:inline wp14:editId="163F7EC6" wp14:anchorId="2DCC5637">
+            <wp:extent cx="5724525" cy="2714625"/>
+            <wp:effectExtent l="0" t="0" r="0" b="0"/>
+            <wp:docPr id="392524719" name="drawing"/>
+            <wp:cNvGraphicFramePr>
+              <a:graphicFrameLocks noChangeAspect="1"/>
+            </wp:cNvGraphicFramePr>
+            <a:graphic>
+              <a:graphicData xmlns:a="http://schemas.openxmlformats.org/drawingml/2006/main" uri="http://schemas.openxmlformats.org/drawingml/2006/picture">
+                <pic:pic xmlns:pic="http://schemas.openxmlformats.org/drawingml/2006/picture">
+                  <pic:nvPicPr>
+                    <pic:cNvPr id="392524719" name="Picture 392524719"/>
+                    <pic:cNvPicPr/>
+                  </pic:nvPicPr>
+                  <pic:blipFill>
+                    <a:blip xmlns:r="http://schemas.openxmlformats.org/officeDocument/2006/relationships" r:embed="rId1702587705">
+                      <a:extLst>
+                        <a:ext uri="{28A0092B-C50C-407E-A947-70E740481C1C}">
+                          <a14:useLocalDpi xmlns:a14="http://schemas.microsoft.com/office/drawing/2010/main"/>
+                        </a:ext>
+                      </a:extLst>
+                    </a:blip>
+                    <a:stretch>
+                      <a:fillRect/>
+                    </a:stretch>
+                  </pic:blipFill>
+                  <pic:spPr>
+                    <a:xfrm>
+                      <a:off x="0" y="0"/>
+                      <a:ext cx="5724525" cy="2714625"/>
+                    </a:xfrm>
+                    <a:prstGeom prst="rect">
+                      <a:avLst/>
+                    </a:prstGeom>
+                  </pic:spPr>
+                </pic:pic>
+              </a:graphicData>
+            </a:graphic>
+          </wp:inline>
+        </w:drawing>
+      </w:r>
+    </w:p>
     <w:p xmlns:wp14="http://schemas.microsoft.com/office/word/2010/wordml" wp14:textId="77777777">
       <w:pPr>
         <w:pStyle w:val="Heading1"/>
@@ -667,6 +767,15 @@
         </w:rPr>
         <w:t>Além disso, o desenvolvimento do sistema com quiz e dashboard permite aplicar conhecimentos técnicos importantes, coleta de dados, tratamento dos dados e exibição dos dados</w:t>
       </w:r>
+    </w:p>
+    <w:p>
+      <w:pPr>
+        <w:pStyle w:val="Normal"/>
+        <w:spacing w:before="240" w:after="240"/>
+        <w:rPr>
+          <w:lang w:val="en-US"/>
+        </w:rPr>
+      </w:pPr>
     </w:p>
     <w:p xmlns:wp14="http://schemas.microsoft.com/office/word/2010/wordml" wp14:textId="29BA50F3">
       <w:pPr>
@@ -2032,7 +2141,9 @@
         </w:numPr>
         <w:spacing w:before="0" w:beforeAutospacing="off" w:after="0" w:afterAutospacing="off" w:lineRule="auto"/>
         <w:ind w:left="720" w:hanging="360"/>
-        <w:rPr/>
+        <w:rPr>
+          <w:lang w:val="en-US"/>
+        </w:rPr>
       </w:pPr>
       <w:r>
         <w:rPr>
@@ -2041,15 +2152,463 @@
         <w:t>Escopo reduzido para atender aos requisitos da disciplina</w:t>
       </w:r>
     </w:p>
-    <w:p xmlns:wp14="http://schemas.microsoft.com/office/word/2010/wordml" wp14:textId="77777777">
-      <w:pPr>
-        <w:rPr/>
-      </w:pPr>
-      <w:r>
-        <w:rPr>
-          <w:rtl w:val="0"/>
-        </w:rPr>
-      </w:r>
+    <w:p xmlns:wp14="http://schemas.microsoft.com/office/word/2010/wordml" wp14:textId="1C179EFA">
+      <w:pPr>
+        <w:spacing w:before="0" w:beforeAutospacing="off" w:after="0" w:afterAutospacing="off"/>
+        <w:rPr>
+          <w:lang w:val="en-US"/>
+        </w:rPr>
+      </w:pPr>
+    </w:p>
+    <w:p xmlns:wp14="http://schemas.microsoft.com/office/word/2010/wordml" wp14:textId="02F81C64">
+      <w:pPr>
+        <w:spacing w:before="0" w:beforeAutospacing="off" w:after="0" w:afterAutospacing="off"/>
+        <w:rPr>
+          <w:lang w:val="en-US"/>
+        </w:rPr>
+      </w:pPr>
+    </w:p>
+    <w:p xmlns:wp14="http://schemas.microsoft.com/office/word/2010/wordml" wp14:textId="777DF011">
+      <w:pPr>
+        <w:spacing w:before="0" w:beforeAutospacing="off" w:after="0" w:afterAutospacing="off"/>
+        <w:rPr>
+          <w:lang w:val="en-US"/>
+        </w:rPr>
+      </w:pPr>
+    </w:p>
+    <w:p xmlns:wp14="http://schemas.microsoft.com/office/word/2010/wordml" wp14:textId="140AF195">
+      <w:pPr>
+        <w:pStyle w:val="Heading1"/>
+        <w:rPr>
+          <w:lang w:val="en-US"/>
+        </w:rPr>
+      </w:pPr>
+      <w:r>
+        <w:rPr>
+          <w:lang w:val="en-US"/>
+        </w:rPr>
+        <w:t>Diagrama</w:t>
+      </w:r>
+      <w:r>
+        <w:rPr>
+          <w:lang w:val="en-US"/>
+        </w:rPr>
+        <w:t xml:space="preserve"> de </w:t>
+      </w:r>
+      <w:r>
+        <w:rPr>
+          <w:lang w:val="en-US"/>
+        </w:rPr>
+        <w:t>Solução</w:t>
+      </w:r>
+      <w:r>
+        <w:rPr>
+          <w:lang w:val="en-US"/>
+        </w:rPr>
+        <w:t xml:space="preserve"> Técnica</w:t>
+      </w:r>
+    </w:p>
+    <w:p xmlns:wp14="http://schemas.microsoft.com/office/word/2010/wordml" wp14:textId="3F27FEA4">
+      <w:pPr>
+        <w:pStyle w:val="Normal"/>
+        <w:jc w:val="center"/>
+      </w:pPr>
+      <w:r>
+        <w:drawing>
+          <wp:inline xmlns:wp14="http://schemas.microsoft.com/office/word/2010/wordprocessingDrawing" wp14:editId="32DDCDDB" wp14:anchorId="65144007">
+            <wp:extent cx="5705475" cy="3314700"/>
+            <wp:effectExtent l="0" t="0" r="0" b="0"/>
+            <wp:docPr id="365890741" name="drawing"/>
+            <wp:cNvGraphicFramePr>
+              <a:graphicFrameLocks noChangeAspect="1"/>
+            </wp:cNvGraphicFramePr>
+            <a:graphic>
+              <a:graphicData xmlns:a="http://schemas.openxmlformats.org/drawingml/2006/main" uri="http://schemas.openxmlformats.org/drawingml/2006/picture">
+                <pic:pic xmlns:pic="http://schemas.openxmlformats.org/drawingml/2006/picture">
+                  <pic:nvPicPr>
+                    <pic:cNvPr id="365890741" name="Picture 365890741"/>
+                    <pic:cNvPicPr/>
+                  </pic:nvPicPr>
+                  <pic:blipFill>
+                    <a:blip xmlns:r="http://schemas.openxmlformats.org/officeDocument/2006/relationships" r:embed="rId1300420741">
+                      <a:extLst>
+                        <a:ext uri="{28A0092B-C50C-407E-A947-70E740481C1C}">
+                          <a14:useLocalDpi xmlns:a14="http://schemas.microsoft.com/office/drawing/2010/main"/>
+                        </a:ext>
+                      </a:extLst>
+                    </a:blip>
+                    <a:stretch>
+                      <a:fillRect/>
+                    </a:stretch>
+                  </pic:blipFill>
+                  <pic:spPr>
+                    <a:xfrm>
+                      <a:off x="0" y="0"/>
+                      <a:ext cx="5705475" cy="3314700"/>
+                    </a:xfrm>
+                    <a:prstGeom prst="rect">
+                      <a:avLst/>
+                    </a:prstGeom>
+                  </pic:spPr>
+                </pic:pic>
+              </a:graphicData>
+            </a:graphic>
+          </wp:inline>
+        </w:drawing>
+      </w:r>
+    </w:p>
+    <w:p xmlns:wp14="http://schemas.microsoft.com/office/word/2010/wordml" wp14:textId="227BD0F5">
+      <w:pPr>
+        <w:spacing w:before="0" w:beforeAutospacing="off" w:after="0" w:afterAutospacing="off"/>
+        <w:rPr>
+          <w:lang w:val="en-US"/>
+        </w:rPr>
+      </w:pPr>
+    </w:p>
+    <w:p xmlns:wp14="http://schemas.microsoft.com/office/word/2010/wordml" wp14:textId="10C36A6C">
+      <w:pPr>
+        <w:pStyle w:val="Heading1"/>
+        <w:rPr>
+          <w:lang w:val="en-US"/>
+        </w:rPr>
+      </w:pPr>
+      <w:r>
+        <w:rPr>
+          <w:lang w:val="en-US"/>
+        </w:rPr>
+        <w:t>Metodologias</w:t>
+      </w:r>
+      <w:r>
+        <w:rPr>
+          <w:lang w:val="en-US"/>
+        </w:rPr>
+        <w:t xml:space="preserve"> Utilizadas</w:t>
+      </w:r>
+    </w:p>
+    <w:p xmlns:wp14="http://schemas.microsoft.com/office/word/2010/wordml" wp14:textId="07F1DCCC">
+      <w:pPr/>
+    </w:p>
+    <w:p xmlns:wp14="http://schemas.microsoft.com/office/word/2010/wordml" wp14:textId="77777777">
+      <w:pPr>
+        <w:pStyle w:val="Heading1"/>
+      </w:pPr>
+      <w:r>
+        <w:rPr/>
+        <w:t>Tecnologias Utilizadas</w:t>
+      </w:r>
+    </w:p>
+    <w:tbl>
+      <w:tblPr>
+        <w:tblStyle w:val="TableGrid"/>
+        <w:tblW w:w="0" w:type="auto"/>
+        <w:jc w:val="center"/>
+        <w:tblLook w:val="06A0" w:firstRow="1" w:lastRow="0" w:firstColumn="1" w:lastColumn="0" w:noHBand="1" w:noVBand="1"/>
+      </w:tblPr>
+      <w:tblGrid>
+        <w:gridCol w:w="2670"/>
+        <w:gridCol w:w="6465"/>
+      </w:tblGrid>
+      <w:tr>
+        <w:trPr>
+          <w:trHeight w:val="300"/>
+        </w:trPr>
+        <w:tc>
+          <w:tcPr>
+            <w:tcW w:w="2670" w:type="dxa"/>
+            <w:tcMar/>
+          </w:tcPr>
+          <w:p>
+            <w:pPr>
+              <w:pStyle w:val="Normal"/>
+              <w:jc w:val="center"/>
+            </w:pPr>
+            <w:r>
+              <w:rPr/>
+              <w:t>TECNOLOGIAS</w:t>
+            </w:r>
+          </w:p>
+        </w:tc>
+        <w:tc>
+          <w:tcPr>
+            <w:tcW w:w="6465" w:type="dxa"/>
+            <w:tcMar/>
+          </w:tcPr>
+          <w:p>
+            <w:pPr>
+              <w:pStyle w:val="Normal"/>
+              <w:suppressLineNumbers w:val="0"/>
+              <w:bidi w:val="0"/>
+              <w:spacing w:before="0" w:beforeAutospacing="off" w:after="0" w:afterAutospacing="off" w:line="240" w:lineRule="auto"/>
+              <w:ind w:left="0" w:right="0"/>
+              <w:jc w:val="center"/>
+            </w:pPr>
+            <w:r>
+              <w:rPr/>
+              <w:t>DESCRICÃO</w:t>
+            </w:r>
+          </w:p>
+        </w:tc>
+      </w:tr>
+      <w:tr>
+        <w:trPr>
+          <w:trHeight w:val="300"/>
+        </w:trPr>
+        <w:tc>
+          <w:tcPr>
+            <w:tcW w:w="2670" w:type="dxa"/>
+            <w:tcMar/>
+          </w:tcPr>
+          <w:p>
+            <w:pPr>
+              <w:pStyle w:val="Normal"/>
+              <w:jc w:val="center"/>
+            </w:pPr>
+            <w:r>
+              <w:rPr/>
+              <w:t>HTML5</w:t>
+            </w:r>
+          </w:p>
+        </w:tc>
+        <w:tc>
+          <w:tcPr>
+            <w:tcW w:w="6465" w:type="dxa"/>
+            <w:tcMar/>
+          </w:tcPr>
+          <w:p>
+            <w:pPr>
+              <w:pStyle w:val="Normal"/>
+              <w:jc w:val="center"/>
+            </w:pPr>
+          </w:p>
+        </w:tc>
+      </w:tr>
+      <w:tr>
+        <w:trPr>
+          <w:trHeight w:val="300"/>
+        </w:trPr>
+        <w:tc>
+          <w:tcPr>
+            <w:tcW w:w="2670" w:type="dxa"/>
+            <w:tcMar/>
+          </w:tcPr>
+          <w:p>
+            <w:pPr>
+              <w:pStyle w:val="Normal"/>
+              <w:jc w:val="center"/>
+            </w:pPr>
+            <w:r>
+              <w:rPr/>
+              <w:t>CSS3</w:t>
+            </w:r>
+          </w:p>
+        </w:tc>
+        <w:tc>
+          <w:tcPr>
+            <w:tcW w:w="6465" w:type="dxa"/>
+            <w:tcMar/>
+          </w:tcPr>
+          <w:p>
+            <w:pPr>
+              <w:pStyle w:val="Normal"/>
+              <w:jc w:val="center"/>
+            </w:pPr>
+          </w:p>
+        </w:tc>
+      </w:tr>
+      <w:tr>
+        <w:trPr>
+          <w:trHeight w:val="300"/>
+        </w:trPr>
+        <w:tc>
+          <w:tcPr>
+            <w:tcW w:w="2670" w:type="dxa"/>
+            <w:tcMar/>
+          </w:tcPr>
+          <w:p>
+            <w:pPr>
+              <w:pStyle w:val="Normal"/>
+              <w:jc w:val="center"/>
+              <w:rPr>
+                <w:lang w:val="pt-BR"/>
+              </w:rPr>
+            </w:pPr>
+            <w:r>
+              <w:rPr>
+                <w:lang w:val="pt-BR"/>
+              </w:rPr>
+              <w:t>Node.js</w:t>
+            </w:r>
+          </w:p>
+        </w:tc>
+        <w:tc>
+          <w:tcPr>
+            <w:tcW w:w="6465" w:type="dxa"/>
+            <w:tcMar/>
+          </w:tcPr>
+          <w:p>
+            <w:pPr>
+              <w:pStyle w:val="Normal"/>
+              <w:jc w:val="center"/>
+            </w:pPr>
+          </w:p>
+        </w:tc>
+      </w:tr>
+      <w:tr>
+        <w:trPr>
+          <w:trHeight w:val="300"/>
+        </w:trPr>
+        <w:tc>
+          <w:tcPr>
+            <w:tcW w:w="2670" w:type="dxa"/>
+            <w:tcMar/>
+          </w:tcPr>
+          <w:p>
+            <w:pPr>
+              <w:pStyle w:val="Normal"/>
+              <w:jc w:val="center"/>
+            </w:pPr>
+            <w:r>
+              <w:rPr/>
+              <w:t>MySQL</w:t>
+            </w:r>
+          </w:p>
+        </w:tc>
+        <w:tc>
+          <w:tcPr>
+            <w:tcW w:w="6465" w:type="dxa"/>
+            <w:tcMar/>
+          </w:tcPr>
+          <w:p>
+            <w:pPr>
+              <w:pStyle w:val="Normal"/>
+              <w:jc w:val="center"/>
+            </w:pPr>
+          </w:p>
+        </w:tc>
+      </w:tr>
+      <w:tr>
+        <w:trPr>
+          <w:trHeight w:val="300"/>
+        </w:trPr>
+        <w:tc>
+          <w:tcPr>
+            <w:tcW w:w="2670" w:type="dxa"/>
+            <w:tcMar/>
+          </w:tcPr>
+          <w:p>
+            <w:pPr>
+              <w:pStyle w:val="Normal"/>
+              <w:jc w:val="center"/>
+            </w:pPr>
+            <w:r>
+              <w:rPr>
+                <w:lang w:val="pt-BR"/>
+              </w:rPr>
+              <w:t xml:space="preserve">Oracle </w:t>
+            </w:r>
+            <w:r>
+              <w:rPr>
+                <w:lang w:val="pt-BR"/>
+              </w:rPr>
+              <w:t>Virtual Box</w:t>
+            </w:r>
+          </w:p>
+        </w:tc>
+        <w:tc>
+          <w:tcPr>
+            <w:tcW w:w="6465" w:type="dxa"/>
+            <w:tcMar/>
+          </w:tcPr>
+          <w:p>
+            <w:pPr>
+              <w:pStyle w:val="Normal"/>
+              <w:jc w:val="center"/>
+            </w:pPr>
+          </w:p>
+        </w:tc>
+      </w:tr>
+      <w:tr>
+        <w:trPr>
+          <w:trHeight w:val="300"/>
+        </w:trPr>
+        <w:tc>
+          <w:tcPr>
+            <w:tcW w:w="2670" w:type="dxa"/>
+            <w:tcMar/>
+          </w:tcPr>
+          <w:p>
+            <w:pPr>
+              <w:pStyle w:val="Normal"/>
+              <w:jc w:val="center"/>
+            </w:pPr>
+            <w:r>
+              <w:rPr>
+                <w:lang w:val="pt-BR"/>
+              </w:rPr>
+              <w:t>Github</w:t>
+            </w:r>
+          </w:p>
+        </w:tc>
+        <w:tc>
+          <w:tcPr>
+            <w:tcW w:w="6465" w:type="dxa"/>
+            <w:tcMar/>
+          </w:tcPr>
+          <w:p>
+            <w:pPr>
+              <w:pStyle w:val="Normal"/>
+              <w:jc w:val="center"/>
+            </w:pPr>
+          </w:p>
+        </w:tc>
+      </w:tr>
+      <w:tr>
+        <w:trPr>
+          <w:trHeight w:val="300"/>
+        </w:trPr>
+        <w:tc>
+          <w:tcPr>
+            <w:tcW w:w="2670" w:type="dxa"/>
+            <w:tcMar/>
+          </w:tcPr>
+          <w:p>
+            <w:pPr>
+              <w:pStyle w:val="Normal"/>
+              <w:jc w:val="center"/>
+            </w:pPr>
+            <w:r>
+              <w:rPr>
+                <w:lang w:val="pt-BR"/>
+              </w:rPr>
+              <w:t>Trello</w:t>
+            </w:r>
+          </w:p>
+        </w:tc>
+        <w:tc>
+          <w:tcPr>
+            <w:tcW w:w="6465" w:type="dxa"/>
+            <w:tcMar/>
+          </w:tcPr>
+          <w:p>
+            <w:pPr>
+              <w:pStyle w:val="Normal"/>
+              <w:jc w:val="center"/>
+            </w:pPr>
+          </w:p>
+        </w:tc>
+      </w:tr>
+    </w:tbl>
+    <w:p xmlns:wp14="http://schemas.microsoft.com/office/word/2010/wordml" wp14:textId="044686B7">
+      <w:pPr>
+        <w:pStyle w:val="Normal"/>
+        <w:jc w:val="center"/>
+      </w:pPr>
+    </w:p>
+    <w:p>
+      <w:pPr>
+        <w:pStyle w:val="Normal"/>
+        <w:jc w:val="left"/>
+      </w:pPr>
     </w:p>
     <w:sectPr>
       <w:pgSz w:w="11909" w:h="16834" w:orient="portrait"/>
@@ -3028,6 +3587,32 @@
       <w:sz w:val="30"/>
       <w:szCs w:val="30"/>
     </w:rPr>
+  </w:style>
+  <w:style xmlns:w="http://schemas.openxmlformats.org/wordprocessingml/2006/main" w:type="table" w:styleId="TableGrid">
+    <w:name xmlns:w="http://schemas.openxmlformats.org/wordprocessingml/2006/main" w:val="Table Grid"/>
+    <w:basedOn xmlns:w="http://schemas.openxmlformats.org/wordprocessingml/2006/main" w:val="TableNormal"/>
+    <w:uiPriority xmlns:w="http://schemas.openxmlformats.org/wordprocessingml/2006/main" w:val="59"/>
+    <w:rsid xmlns:w="http://schemas.openxmlformats.org/wordprocessingml/2006/main" w:val="00FB4123"/>
+    <w:pPr xmlns:w="http://schemas.openxmlformats.org/wordprocessingml/2006/main">
+      <w:spacing w:after="0" w:line="240" w:lineRule="auto"/>
+    </w:pPr>
+    <w:tblPr xmlns:w="http://schemas.openxmlformats.org/wordprocessingml/2006/main">
+      <w:tblInd w:w="0" w:type="dxa"/>
+      <w:tblBorders>
+        <w:top w:val="single" w:color="000000" w:themeColor="text1" w:sz="4" w:space="0"/>
+        <w:left w:val="single" w:color="000000" w:themeColor="text1" w:sz="4" w:space="0"/>
+        <w:bottom w:val="single" w:color="000000" w:themeColor="text1" w:sz="4" w:space="0"/>
+        <w:right w:val="single" w:color="000000" w:themeColor="text1" w:sz="4" w:space="0"/>
+        <w:insideH w:val="single" w:color="000000" w:themeColor="text1" w:sz="4" w:space="0"/>
+        <w:insideV w:val="single" w:color="000000" w:themeColor="text1" w:sz="4" w:space="0"/>
+      </w:tblBorders>
+      <w:tblCellMar>
+        <w:top w:w="0" w:type="dxa"/>
+        <w:left w:w="108" w:type="dxa"/>
+        <w:bottom w:w="0" w:type="dxa"/>
+        <w:right w:w="108" w:type="dxa"/>
+      </w:tblCellMar>
+    </w:tblPr>
   </w:style>
 </w:styles>
 </file>

</xml_diff>

<commit_message>
Subindo Documentação Final do projeto
</commit_message>
<xml_diff>
--- a/Documentação_Rocket_League.docx
+++ b/Documentação_Rocket_League.docx
@@ -2,17 +2,60 @@
 <file path=word/document.xml><?xml version="1.0" encoding="utf-8"?>
 <w:document xmlns:wp14="http://schemas.microsoft.com/office/word/2010/wordprocessingDrawing" xmlns:mc="http://schemas.openxmlformats.org/markup-compatibility/2006" xmlns:o="urn:schemas-microsoft-com:office:office" xmlns:r="http://schemas.openxmlformats.org/officeDocument/2006/relationships" xmlns:m="http://schemas.openxmlformats.org/officeDocument/2006/math" xmlns:v="urn:schemas-microsoft-com:vml" xmlns:wp="http://schemas.openxmlformats.org/drawingml/2006/wordprocessingDrawing" xmlns:w10="urn:schemas-microsoft-com:office:word" xmlns:w="http://schemas.openxmlformats.org/wordprocessingml/2006/main" xmlns:wne="http://schemas.microsoft.com/office/word/2006/wordml" xmlns:sl="http://schemas.openxmlformats.org/schemaLibrary/2006/main" xmlns:a="http://schemas.openxmlformats.org/drawingml/2006/main" xmlns:pic="http://schemas.openxmlformats.org/drawingml/2006/picture" xmlns:c="http://schemas.openxmlformats.org/drawingml/2006/chart" xmlns:lc="http://schemas.openxmlformats.org/drawingml/2006/lockedCanvas" xmlns:dgm="http://schemas.openxmlformats.org/drawingml/2006/diagram" xmlns:wps="http://schemas.microsoft.com/office/word/2010/wordprocessingShape" xmlns:wpg="http://schemas.microsoft.com/office/word/2010/wordprocessingGroup" xmlns:w14="http://schemas.microsoft.com/office/word/2010/wordml" xmlns:w15="http://schemas.microsoft.com/office/word/2012/wordml" xmlns:w16="http://schemas.microsoft.com/office/word/2018/wordml" xmlns:w16cex="http://schemas.microsoft.com/office/word/2018/wordml/cex" xmlns:w16cid="http://schemas.microsoft.com/office/word/2016/wordml/cid" xmlns="http://schemas.microsoft.com/office/tasks/2019/documenttasks" xmlns:cr="http://schemas.microsoft.com/office/comments/2020/reactions" xmlns:a14="http://schemas.microsoft.com/office/drawing/2010/main" mc:Ignorable="wp14">
   <w:body>
-    <w:p xmlns:wp14="http://schemas.microsoft.com/office/word/2010/wordml" wp14:textId="77777777">
+    <w:p xmlns:wp14="http://schemas.microsoft.com/office/word/2010/wordml" wp14:textId="3A53E740">
       <w:pPr>
         <w:pStyle w:val="Title"/>
-        <w:ind w:hanging="992.1259842519685"/>
-        <w:rPr>
-          <w:sz w:val="64"/>
-          <w:szCs w:val="64"/>
-        </w:rPr>
-      </w:pPr>
-      <w:bookmarkStart w:name="_ov2g3imimiah" w:colFirst="0" w:colLast="0" w:id="0"/>
-      <w:bookmarkEnd w:id="0"/>
+        <w:ind w:hanging="992"/>
+      </w:pPr>
+      <w:r>
+        <w:drawing>
+          <wp:anchor xmlns:wp14="http://schemas.microsoft.com/office/word/2010/wordprocessingDrawing" distT="0" distB="0" distL="114300" distR="114300" simplePos="0" relativeHeight="251658240" behindDoc="0" locked="0" layoutInCell="1" allowOverlap="1" wp14:editId="7FDF0626" wp14:anchorId="5DBB3658">
+            <wp:simplePos x="0" y="0"/>
+            <wp:positionH relativeFrom="column">
+              <wp:align>left</wp:align>
+            </wp:positionH>
+            <wp:positionV relativeFrom="paragraph">
+              <wp:posOffset>0</wp:posOffset>
+            </wp:positionV>
+            <wp:extent cx="1176338" cy="659745"/>
+            <wp:effectExtent l="0" t="0" r="0" b="0"/>
+            <wp:wrapSquare wrapText="bothSides"/>
+            <wp:docPr id="1" name="image1.png"/>
+            <wp:cNvGraphicFramePr/>
+            <a:graphic>
+              <a:graphicData xmlns:a="http://schemas.openxmlformats.org/drawingml/2006/main" uri="http://schemas.openxmlformats.org/drawingml/2006/picture">
+                <pic:pic xmlns:pic="http://schemas.openxmlformats.org/drawingml/2006/picture">
+                  <pic:nvPicPr>
+                    <pic:cNvPr id="0" name="image1.png"/>
+                    <pic:cNvPicPr preferRelativeResize="0"/>
+                  </pic:nvPicPr>
+                  <pic:blipFill>
+                    <a:blip xmlns:r="http://schemas.openxmlformats.org/officeDocument/2006/relationships" r:embed="rId6"/>
+                    <a:srcRect l="0" t="0" r="0" b="0"/>
+                    <a:stretch>
+                      <a:fillRect/>
+                    </a:stretch>
+                  </pic:blipFill>
+                  <pic:spPr>
+                    <a:xfrm>
+                      <a:off x="0" y="0"/>
+                      <a:ext cx="1176338" cy="659745"/>
+                    </a:xfrm>
+                    <a:prstGeom prst="rect"/>
+                    <a:ln/>
+                  </pic:spPr>
+                </pic:pic>
+              </a:graphicData>
+            </a:graphic>
+            <wp14:sizeRelH relativeFrom="page">
+              <wp14:pctWidth>0</wp14:pctWidth>
+            </wp14:sizeRelH>
+            <wp14:sizeRelV relativeFrom="page">
+              <wp14:pctHeight>0</wp14:pctHeight>
+            </wp14:sizeRelV>
+          </wp:anchor>
+        </w:drawing>
+      </w:r>
       <w:r>
         <w:rPr>
           <w:sz w:val="64"/>
@@ -22,7 +65,7 @@
           <wp:inline xmlns:wp14="http://schemas.microsoft.com/office/word/2010/wordprocessingDrawing" distT="114300" distB="114300" distL="114300" distR="114300" wp14:anchorId="3A8E9F72" wp14:editId="7777777">
             <wp:extent cx="1176338" cy="659745"/>
             <wp:effectExtent l="0" t="0" r="0" b="0"/>
-            <wp:docPr id="1" name="image1.png"/>
+            <wp:docPr id="154369186" name="image1.png"/>
             <a:graphic>
               <a:graphicData uri="http://schemas.openxmlformats.org/drawingml/2006/picture">
                 <pic:pic>
@@ -777,6 +820,33 @@
         </w:rPr>
       </w:pPr>
     </w:p>
+    <w:p>
+      <w:pPr>
+        <w:pStyle w:val="Normal"/>
+        <w:spacing w:before="240" w:after="240"/>
+        <w:rPr>
+          <w:lang w:val="en-US"/>
+        </w:rPr>
+      </w:pPr>
+    </w:p>
+    <w:p>
+      <w:pPr>
+        <w:pStyle w:val="Normal"/>
+        <w:spacing w:before="240" w:after="240"/>
+        <w:rPr>
+          <w:lang w:val="en-US"/>
+        </w:rPr>
+      </w:pPr>
+    </w:p>
+    <w:p>
+      <w:pPr>
+        <w:pStyle w:val="Normal"/>
+        <w:spacing w:before="240" w:after="240"/>
+        <w:rPr>
+          <w:lang w:val="en-US"/>
+        </w:rPr>
+      </w:pPr>
+    </w:p>
     <w:p xmlns:wp14="http://schemas.microsoft.com/office/word/2010/wordml" wp14:textId="29BA50F3">
       <w:pPr>
         <w:pStyle w:val="Heading1"/>
@@ -2176,7 +2246,7 @@
         </w:rPr>
       </w:pPr>
     </w:p>
-    <w:p xmlns:wp14="http://schemas.microsoft.com/office/word/2010/wordml" wp14:textId="140AF195">
+    <w:p>
       <w:pPr>
         <w:pStyle w:val="Heading1"/>
         <w:rPr>
@@ -2187,38 +2257,25 @@
         <w:rPr>
           <w:lang w:val="en-US"/>
         </w:rPr>
-        <w:t>Diagrama</w:t>
-      </w:r>
-      <w:r>
-        <w:rPr>
-          <w:lang w:val="en-US"/>
-        </w:rPr>
-        <w:t xml:space="preserve"> de </w:t>
-      </w:r>
-      <w:r>
-        <w:rPr>
-          <w:lang w:val="en-US"/>
-        </w:rPr>
-        <w:t>Solução</w:t>
-      </w:r>
-      <w:r>
-        <w:rPr>
-          <w:lang w:val="en-US"/>
-        </w:rPr>
-        <w:t xml:space="preserve"> Técnica</w:t>
-      </w:r>
-    </w:p>
-    <w:p xmlns:wp14="http://schemas.microsoft.com/office/word/2010/wordml" wp14:textId="3F27FEA4">
+        <w:t>Modelagem</w:t>
+      </w:r>
+      <w:r>
+        <w:rPr>
+          <w:lang w:val="en-US"/>
+        </w:rPr>
+        <w:t xml:space="preserve"> do Banco de Dados</w:t>
+      </w:r>
+    </w:p>
+    <w:p>
       <w:pPr>
         <w:pStyle w:val="Normal"/>
-        <w:jc w:val="center"/>
       </w:pPr>
       <w:r>
         <w:drawing>
-          <wp:inline xmlns:wp14="http://schemas.microsoft.com/office/word/2010/wordprocessingDrawing" wp14:editId="32DDCDDB" wp14:anchorId="65144007">
-            <wp:extent cx="5705475" cy="3314700"/>
+          <wp:inline wp14:editId="40868FF8" wp14:anchorId="6C602A03">
+            <wp:extent cx="5724525" cy="3829050"/>
             <wp:effectExtent l="0" t="0" r="0" b="0"/>
-            <wp:docPr id="365890741" name="drawing"/>
+            <wp:docPr id="1669415157" name="drawing"/>
             <wp:cNvGraphicFramePr>
               <a:graphicFrameLocks noChangeAspect="1"/>
             </wp:cNvGraphicFramePr>
@@ -2226,11 +2283,11 @@
               <a:graphicData xmlns:a="http://schemas.openxmlformats.org/drawingml/2006/main" uri="http://schemas.openxmlformats.org/drawingml/2006/picture">
                 <pic:pic xmlns:pic="http://schemas.openxmlformats.org/drawingml/2006/picture">
                   <pic:nvPicPr>
-                    <pic:cNvPr id="365890741" name="Picture 365890741"/>
+                    <pic:cNvPr id="1669415157" name="Picture 1669415157"/>
                     <pic:cNvPicPr/>
                   </pic:nvPicPr>
                   <pic:blipFill>
-                    <a:blip xmlns:r="http://schemas.openxmlformats.org/officeDocument/2006/relationships" r:embed="rId1300420741">
+                    <a:blip xmlns:r="http://schemas.openxmlformats.org/officeDocument/2006/relationships" r:embed="rId1302148621">
                       <a:extLst>
                         <a:ext uri="{28A0092B-C50C-407E-A947-70E740481C1C}">
                           <a14:useLocalDpi xmlns:a14="http://schemas.microsoft.com/office/drawing/2010/main"/>
@@ -2244,7 +2301,7 @@
                   <pic:spPr>
                     <a:xfrm>
                       <a:off x="0" y="0"/>
-                      <a:ext cx="5705475" cy="3314700"/>
+                      <a:ext cx="5724525" cy="3829050"/>
                     </a:xfrm>
                     <a:prstGeom prst="rect">
                       <a:avLst/>
@@ -2257,49 +2314,1553 @@
         </w:drawing>
       </w:r>
     </w:p>
-    <w:p xmlns:wp14="http://schemas.microsoft.com/office/word/2010/wordml" wp14:textId="227BD0F5">
-      <w:pPr>
+    <w:p xmlns:wp14="http://schemas.microsoft.com/office/word/2010/wordml" wp14:textId="140AF195">
+      <w:pPr>
+        <w:pStyle w:val="Heading1"/>
+        <w:rPr>
+          <w:lang w:val="en-US"/>
+        </w:rPr>
+      </w:pPr>
+      <w:r>
+        <w:rPr>
+          <w:lang w:val="en-US"/>
+        </w:rPr>
+        <w:t>Diagrama</w:t>
+      </w:r>
+      <w:r>
+        <w:rPr>
+          <w:lang w:val="en-US"/>
+        </w:rPr>
+        <w:t xml:space="preserve"> de </w:t>
+      </w:r>
+      <w:r>
+        <w:rPr>
+          <w:lang w:val="en-US"/>
+        </w:rPr>
+        <w:t>Solução</w:t>
+      </w:r>
+      <w:r>
+        <w:rPr>
+          <w:lang w:val="en-US"/>
+        </w:rPr>
+        <w:t xml:space="preserve"> Técnica</w:t>
+      </w:r>
+    </w:p>
+    <w:p xmlns:wp14="http://schemas.microsoft.com/office/word/2010/wordml" wp14:textId="5E4D6126">
+      <w:pPr>
+        <w:pStyle w:val="Normal"/>
+        <w:suppressLineNumbers w:val="0"/>
+        <w:bidi w:val="0"/>
+        <w:spacing w:before="0" w:beforeAutospacing="off" w:after="0" w:afterAutospacing="off" w:line="276" w:lineRule="auto"/>
+        <w:ind w:left="0" w:right="0"/>
+        <w:jc w:val="center"/>
+        <w:rPr>
+          <w:u w:val="single"/>
+        </w:rPr>
+      </w:pPr>
+      <w:r>
+        <w:drawing>
+          <wp:inline xmlns:wp14="http://schemas.microsoft.com/office/word/2010/wordprocessingDrawing" wp14:editId="7F24F2AA" wp14:anchorId="3770762E">
+            <wp:extent cx="5724525" cy="3476625"/>
+            <wp:effectExtent l="0" t="0" r="0" b="0"/>
+            <wp:docPr id="504590116" name="drawing"/>
+            <wp:cNvGraphicFramePr>
+              <a:graphicFrameLocks noChangeAspect="1"/>
+            </wp:cNvGraphicFramePr>
+            <a:graphic>
+              <a:graphicData xmlns:a="http://schemas.openxmlformats.org/drawingml/2006/main" uri="http://schemas.openxmlformats.org/drawingml/2006/picture">
+                <pic:pic xmlns:pic="http://schemas.openxmlformats.org/drawingml/2006/picture">
+                  <pic:nvPicPr>
+                    <pic:cNvPr id="504590116" name="Picture 504590116"/>
+                    <pic:cNvPicPr/>
+                  </pic:nvPicPr>
+                  <pic:blipFill>
+                    <a:blip xmlns:r="http://schemas.openxmlformats.org/officeDocument/2006/relationships" r:embed="rId435888784">
+                      <a:extLst>
+                        <a:ext uri="{28A0092B-C50C-407E-A947-70E740481C1C}">
+                          <a14:useLocalDpi xmlns:a14="http://schemas.microsoft.com/office/drawing/2010/main"/>
+                        </a:ext>
+                      </a:extLst>
+                    </a:blip>
+                    <a:stretch>
+                      <a:fillRect/>
+                    </a:stretch>
+                  </pic:blipFill>
+                  <pic:spPr>
+                    <a:xfrm>
+                      <a:off x="0" y="0"/>
+                      <a:ext cx="5724525" cy="3476625"/>
+                    </a:xfrm>
+                    <a:prstGeom prst="rect">
+                      <a:avLst/>
+                    </a:prstGeom>
+                  </pic:spPr>
+                </pic:pic>
+              </a:graphicData>
+            </a:graphic>
+          </wp:inline>
+        </w:drawing>
+      </w:r>
+    </w:p>
+    <w:p>
+      <w:pPr>
+        <w:pStyle w:val="Heading1"/>
+        <w:rPr>
+          <w:lang w:val="en-US"/>
+        </w:rPr>
+      </w:pPr>
+      <w:r>
+        <w:rPr>
+          <w:lang w:val="en-US"/>
+        </w:rPr>
+        <w:t>Metodologias Utilizadas</w:t>
+      </w:r>
+    </w:p>
+    <w:p>
+      <w:pPr>
+        <w:pStyle w:val="Normal"/>
+      </w:pPr>
+      <w:r>
+        <w:rPr>
+          <w:rFonts w:ascii="Arial" w:hAnsi="Arial" w:eastAsia="Arial" w:cs="Arial"/>
+          <w:noProof w:val="0"/>
+          <w:sz w:val="22"/>
+          <w:szCs w:val="22"/>
+          <w:lang w:val="pt-BR"/>
+        </w:rPr>
+        <w:t xml:space="preserve">O desenvolvimento do projeto foi baseado em Scrum, utilizando ciclos de desenvolvimento organizados em sprints semanais. Durante o processo, as tarefas foram planejadas, através da plataforma </w:t>
+      </w:r>
+      <w:r>
+        <w:rPr>
+          <w:noProof w:val="0"/>
+          <w:lang w:val="pt-BR"/>
+        </w:rPr>
+        <w:t>Trello</w:t>
+      </w:r>
+      <w:r>
+        <w:rPr>
+          <w:rFonts w:ascii="Arial" w:hAnsi="Arial" w:eastAsia="Arial" w:cs="Arial"/>
+          <w:noProof w:val="0"/>
+          <w:sz w:val="22"/>
+          <w:szCs w:val="22"/>
+          <w:lang w:val="pt-BR"/>
+        </w:rPr>
+        <w:t>, permitindo melhor organização das funcionalidades, controle de progresso e definição de prioridades</w:t>
+      </w:r>
+      <w:r>
+        <w:rPr>
+          <w:rFonts w:ascii="Arial" w:hAnsi="Arial" w:eastAsia="Arial" w:cs="Arial"/>
+          <w:noProof w:val="0"/>
+          <w:sz w:val="22"/>
+          <w:szCs w:val="22"/>
+          <w:lang w:val="pt-BR"/>
+        </w:rPr>
+        <w:t xml:space="preserve"> dos requisitos</w:t>
+      </w:r>
+      <w:r>
+        <w:rPr>
+          <w:rFonts w:ascii="Arial" w:hAnsi="Arial" w:eastAsia="Arial" w:cs="Arial"/>
+          <w:noProof w:val="0"/>
+          <w:sz w:val="22"/>
+          <w:szCs w:val="22"/>
+          <w:lang w:val="pt-BR"/>
+        </w:rPr>
+        <w:t>.</w:t>
+      </w:r>
+    </w:p>
+    <w:p>
+      <w:pPr>
+        <w:pStyle w:val="Heading1"/>
+        <w:rPr>
+          <w:sz w:val="20"/>
+          <w:szCs w:val="20"/>
+          <w:lang w:val="en-US"/>
+        </w:rPr>
+      </w:pPr>
+      <w:r>
+        <w:rPr>
+          <w:lang w:val="en-US"/>
+        </w:rPr>
+        <w:t>Cronograma</w:t>
+      </w:r>
+    </w:p>
+    <w:p>
+      <w:pPr>
+        <w:pStyle w:val="Heading2"/>
+        <w:rPr>
+          <w:rFonts w:ascii="Arial" w:hAnsi="Arial" w:eastAsia="Arial" w:cs="Arial"/>
+          <w:noProof w:val="0"/>
+          <w:sz w:val="32"/>
+          <w:szCs w:val="32"/>
+          <w:lang w:val="en-US"/>
+        </w:rPr>
+      </w:pPr>
+      <w:r>
+        <w:rPr>
+          <w:rFonts w:ascii="Arial" w:hAnsi="Arial" w:eastAsia="Arial" w:cs="Arial"/>
+          <w:noProof w:val="0"/>
+          <w:sz w:val="32"/>
+          <w:szCs w:val="32"/>
+          <w:lang w:val="en-US"/>
+        </w:rPr>
+        <w:t>Sprint 1 — Planejamento e Estrutura Inicial</w:t>
+      </w:r>
+    </w:p>
+    <w:p>
+      <w:pPr>
+        <w:pStyle w:val="ListParagraph"/>
+        <w:numPr>
+          <w:ilvl w:val="0"/>
+          <w:numId w:val="8"/>
+        </w:numPr>
         <w:spacing w:before="0" w:beforeAutospacing="off" w:after="0" w:afterAutospacing="off"/>
         <w:rPr>
-          <w:lang w:val="en-US"/>
-        </w:rPr>
-      </w:pPr>
-    </w:p>
-    <w:p xmlns:wp14="http://schemas.microsoft.com/office/word/2010/wordml" wp14:textId="10C36A6C">
+          <w:rFonts w:ascii="Arial" w:hAnsi="Arial" w:eastAsia="Arial" w:cs="Arial"/>
+          <w:noProof w:val="0"/>
+          <w:sz w:val="22"/>
+          <w:szCs w:val="22"/>
+          <w:lang w:val="en-US"/>
+        </w:rPr>
+      </w:pPr>
+      <w:r>
+        <w:rPr>
+          <w:rFonts w:ascii="Arial" w:hAnsi="Arial" w:eastAsia="Arial" w:cs="Arial"/>
+          <w:noProof w:val="0"/>
+          <w:sz w:val="22"/>
+          <w:szCs w:val="22"/>
+          <w:lang w:val="en-US"/>
+        </w:rPr>
+        <w:t xml:space="preserve">Definição da ideia do projeto </w:t>
+      </w:r>
+    </w:p>
+    <w:p>
+      <w:pPr>
+        <w:pStyle w:val="ListParagraph"/>
+        <w:numPr>
+          <w:ilvl w:val="0"/>
+          <w:numId w:val="8"/>
+        </w:numPr>
+        <w:spacing w:before="0" w:beforeAutospacing="off" w:after="0" w:afterAutospacing="off"/>
+        <w:rPr>
+          <w:rFonts w:ascii="Arial" w:hAnsi="Arial" w:eastAsia="Arial" w:cs="Arial"/>
+          <w:noProof w:val="0"/>
+          <w:sz w:val="22"/>
+          <w:szCs w:val="22"/>
+          <w:lang w:val="en-US"/>
+        </w:rPr>
+      </w:pPr>
+      <w:r>
+        <w:rPr>
+          <w:rFonts w:ascii="Arial" w:hAnsi="Arial" w:eastAsia="Arial" w:cs="Arial"/>
+          <w:noProof w:val="0"/>
+          <w:sz w:val="22"/>
+          <w:szCs w:val="22"/>
+          <w:lang w:val="en-US"/>
+        </w:rPr>
+        <w:t>Escolher</w:t>
+      </w:r>
+      <w:r>
+        <w:rPr>
+          <w:rFonts w:ascii="Arial" w:hAnsi="Arial" w:eastAsia="Arial" w:cs="Arial"/>
+          <w:noProof w:val="0"/>
+          <w:sz w:val="22"/>
+          <w:szCs w:val="22"/>
+          <w:lang w:val="en-US"/>
+        </w:rPr>
+        <w:t xml:space="preserve"> a abordagem do tema </w:t>
+      </w:r>
+    </w:p>
+    <w:p>
+      <w:pPr>
+        <w:pStyle w:val="ListParagraph"/>
+        <w:numPr>
+          <w:ilvl w:val="0"/>
+          <w:numId w:val="8"/>
+        </w:numPr>
+        <w:spacing w:before="0" w:beforeAutospacing="off" w:after="0" w:afterAutospacing="off"/>
+        <w:rPr>
+          <w:rFonts w:ascii="Arial" w:hAnsi="Arial" w:eastAsia="Arial" w:cs="Arial"/>
+          <w:noProof w:val="0"/>
+          <w:sz w:val="22"/>
+          <w:szCs w:val="22"/>
+          <w:lang w:val="en-US"/>
+        </w:rPr>
+      </w:pPr>
+      <w:r>
+        <w:rPr>
+          <w:rFonts w:ascii="Arial" w:hAnsi="Arial" w:eastAsia="Arial" w:cs="Arial"/>
+          <w:noProof w:val="0"/>
+          <w:sz w:val="22"/>
+          <w:szCs w:val="22"/>
+          <w:lang w:val="en-US"/>
+        </w:rPr>
+        <w:t xml:space="preserve">Criação do Trello para organização </w:t>
+      </w:r>
+    </w:p>
+    <w:p>
+      <w:pPr>
+        <w:pStyle w:val="ListParagraph"/>
+        <w:numPr>
+          <w:ilvl w:val="0"/>
+          <w:numId w:val="8"/>
+        </w:numPr>
+        <w:spacing w:before="0" w:beforeAutospacing="off" w:after="0" w:afterAutospacing="off"/>
+        <w:rPr>
+          <w:rFonts w:ascii="Arial" w:hAnsi="Arial" w:eastAsia="Arial" w:cs="Arial"/>
+          <w:noProof w:val="0"/>
+          <w:sz w:val="22"/>
+          <w:szCs w:val="22"/>
+          <w:lang w:val="en-US"/>
+        </w:rPr>
+      </w:pPr>
+      <w:r>
+        <w:rPr>
+          <w:rFonts w:ascii="Arial" w:hAnsi="Arial" w:eastAsia="Arial" w:cs="Arial"/>
+          <w:noProof w:val="0"/>
+          <w:sz w:val="22"/>
+          <w:szCs w:val="22"/>
+          <w:lang w:val="en-US"/>
+        </w:rPr>
+        <w:t xml:space="preserve">Desenvolvimento da identidade visual </w:t>
+      </w:r>
+    </w:p>
+    <w:p>
+      <w:pPr>
+        <w:pStyle w:val="ListParagraph"/>
+        <w:numPr>
+          <w:ilvl w:val="0"/>
+          <w:numId w:val="8"/>
+        </w:numPr>
+        <w:suppressLineNumbers w:val="0"/>
+        <w:bidi w:val="0"/>
+        <w:spacing w:before="0" w:beforeAutospacing="off" w:after="0" w:afterAutospacing="off" w:line="276" w:lineRule="auto"/>
+        <w:ind w:left="720" w:right="0" w:hanging="360"/>
+        <w:jc w:val="left"/>
+        <w:rPr>
+          <w:rFonts w:ascii="Arial" w:hAnsi="Arial" w:eastAsia="Arial" w:cs="Arial"/>
+          <w:noProof w:val="0"/>
+          <w:sz w:val="22"/>
+          <w:szCs w:val="22"/>
+          <w:lang w:val="en-US"/>
+        </w:rPr>
+      </w:pPr>
+      <w:r>
+        <w:rPr>
+          <w:rFonts w:ascii="Arial" w:hAnsi="Arial" w:eastAsia="Arial" w:cs="Arial"/>
+          <w:noProof w:val="0"/>
+          <w:sz w:val="22"/>
+          <w:szCs w:val="22"/>
+          <w:lang w:val="en-US"/>
+        </w:rPr>
+        <w:t>Documentação Inicial</w:t>
+      </w:r>
+    </w:p>
+    <w:p/>
+    <w:p>
+      <w:pPr>
+        <w:pStyle w:val="Heading2"/>
+        <w:rPr>
+          <w:rFonts w:ascii="Arial" w:hAnsi="Arial" w:eastAsia="Arial" w:cs="Arial"/>
+          <w:noProof w:val="0"/>
+          <w:sz w:val="32"/>
+          <w:szCs w:val="32"/>
+          <w:lang w:val="en-US"/>
+        </w:rPr>
+      </w:pPr>
+      <w:r>
+        <w:rPr>
+          <w:rFonts w:ascii="Arial" w:hAnsi="Arial" w:eastAsia="Arial" w:cs="Arial"/>
+          <w:noProof w:val="0"/>
+          <w:sz w:val="32"/>
+          <w:szCs w:val="32"/>
+          <w:lang w:val="en-US"/>
+        </w:rPr>
+        <w:t xml:space="preserve">Sprint 2 — </w:t>
+      </w:r>
+      <w:r>
+        <w:rPr>
+          <w:rFonts w:ascii="Arial" w:hAnsi="Arial" w:eastAsia="Arial" w:cs="Arial"/>
+          <w:noProof w:val="0"/>
+          <w:sz w:val="32"/>
+          <w:szCs w:val="32"/>
+          <w:lang w:val="en-US"/>
+        </w:rPr>
+        <w:t>Desenvolvimento</w:t>
+      </w:r>
+      <w:r>
+        <w:rPr>
+          <w:rFonts w:ascii="Arial" w:hAnsi="Arial" w:eastAsia="Arial" w:cs="Arial"/>
+          <w:noProof w:val="0"/>
+          <w:sz w:val="32"/>
+          <w:szCs w:val="32"/>
+          <w:lang w:val="en-US"/>
+        </w:rPr>
+        <w:t xml:space="preserve"> Inicial</w:t>
+      </w:r>
+      <w:r>
+        <w:rPr>
+          <w:rFonts w:ascii="Arial" w:hAnsi="Arial" w:eastAsia="Arial" w:cs="Arial"/>
+          <w:noProof w:val="0"/>
+          <w:sz w:val="32"/>
+          <w:szCs w:val="32"/>
+          <w:lang w:val="en-US"/>
+        </w:rPr>
+        <w:t xml:space="preserve"> Front-end</w:t>
+      </w:r>
+    </w:p>
+    <w:p>
+      <w:pPr>
+        <w:pStyle w:val="ListParagraph"/>
+        <w:numPr>
+          <w:ilvl w:val="0"/>
+          <w:numId w:val="9"/>
+        </w:numPr>
+        <w:spacing w:before="0" w:beforeAutospacing="off" w:after="0" w:afterAutospacing="off"/>
+        <w:rPr>
+          <w:rFonts w:ascii="Arial" w:hAnsi="Arial" w:eastAsia="Arial" w:cs="Arial"/>
+          <w:noProof w:val="0"/>
+          <w:sz w:val="22"/>
+          <w:szCs w:val="22"/>
+          <w:lang w:val="en-US"/>
+        </w:rPr>
+      </w:pPr>
+      <w:r>
+        <w:rPr>
+          <w:rFonts w:ascii="Arial" w:hAnsi="Arial" w:eastAsia="Arial" w:cs="Arial"/>
+          <w:noProof w:val="0"/>
+          <w:sz w:val="22"/>
+          <w:szCs w:val="22"/>
+          <w:lang w:val="en-US"/>
+        </w:rPr>
+        <w:t xml:space="preserve">Criação da página inicial </w:t>
+      </w:r>
+    </w:p>
+    <w:p>
+      <w:pPr>
+        <w:pStyle w:val="ListParagraph"/>
+        <w:numPr>
+          <w:ilvl w:val="0"/>
+          <w:numId w:val="9"/>
+        </w:numPr>
+        <w:suppressLineNumbers w:val="0"/>
+        <w:bidi w:val="0"/>
+        <w:spacing w:before="0" w:beforeAutospacing="off" w:after="0" w:afterAutospacing="off" w:line="276" w:lineRule="auto"/>
+        <w:ind w:left="720" w:right="0" w:hanging="360"/>
+        <w:jc w:val="left"/>
+        <w:rPr>
+          <w:rFonts w:ascii="Arial" w:hAnsi="Arial" w:eastAsia="Arial" w:cs="Arial"/>
+          <w:noProof w:val="0"/>
+          <w:sz w:val="22"/>
+          <w:szCs w:val="22"/>
+          <w:lang w:val="en-US"/>
+        </w:rPr>
+      </w:pPr>
+      <w:r>
+        <w:rPr>
+          <w:rFonts w:ascii="Arial" w:hAnsi="Arial" w:eastAsia="Arial" w:cs="Arial"/>
+          <w:noProof w:val="0"/>
+          <w:sz w:val="22"/>
+          <w:szCs w:val="22"/>
+          <w:lang w:val="en-US"/>
+        </w:rPr>
+        <w:t>Criação</w:t>
+      </w:r>
+      <w:r>
+        <w:rPr>
+          <w:rFonts w:ascii="Arial" w:hAnsi="Arial" w:eastAsia="Arial" w:cs="Arial"/>
+          <w:noProof w:val="0"/>
+          <w:sz w:val="22"/>
+          <w:szCs w:val="22"/>
+          <w:lang w:val="en-US"/>
+        </w:rPr>
+        <w:t xml:space="preserve"> da modelagem de dados inicial</w:t>
+      </w:r>
+    </w:p>
+    <w:p>
+      <w:pPr>
+        <w:pStyle w:val="ListParagraph"/>
+        <w:numPr>
+          <w:ilvl w:val="0"/>
+          <w:numId w:val="9"/>
+        </w:numPr>
+        <w:spacing w:before="0" w:beforeAutospacing="off" w:after="0" w:afterAutospacing="off"/>
+        <w:rPr>
+          <w:rFonts w:ascii="Arial" w:hAnsi="Arial" w:eastAsia="Arial" w:cs="Arial"/>
+          <w:noProof w:val="0"/>
+          <w:sz w:val="22"/>
+          <w:szCs w:val="22"/>
+          <w:lang w:val="en-US"/>
+        </w:rPr>
+      </w:pPr>
+      <w:r>
+        <w:rPr>
+          <w:rFonts w:ascii="Arial" w:hAnsi="Arial" w:eastAsia="Arial" w:cs="Arial"/>
+          <w:noProof w:val="0"/>
+          <w:sz w:val="22"/>
+          <w:szCs w:val="22"/>
+          <w:lang w:val="en-US"/>
+        </w:rPr>
+        <w:t>Criação</w:t>
+      </w:r>
+      <w:r>
+        <w:rPr>
+          <w:rFonts w:ascii="Arial" w:hAnsi="Arial" w:eastAsia="Arial" w:cs="Arial"/>
+          <w:noProof w:val="0"/>
+          <w:sz w:val="22"/>
+          <w:szCs w:val="22"/>
+          <w:lang w:val="en-US"/>
+        </w:rPr>
+        <w:t xml:space="preserve"> d</w:t>
+      </w:r>
+      <w:r>
+        <w:rPr>
+          <w:rFonts w:ascii="Arial" w:hAnsi="Arial" w:eastAsia="Arial" w:cs="Arial"/>
+          <w:noProof w:val="0"/>
+          <w:sz w:val="22"/>
+          <w:szCs w:val="22"/>
+          <w:lang w:val="en-US"/>
+        </w:rPr>
+        <w:t>a lógica</w:t>
+      </w:r>
+      <w:r>
+        <w:rPr>
+          <w:rFonts w:ascii="Arial" w:hAnsi="Arial" w:eastAsia="Arial" w:cs="Arial"/>
+          <w:noProof w:val="0"/>
+          <w:sz w:val="22"/>
+          <w:szCs w:val="22"/>
+          <w:lang w:val="en-US"/>
+        </w:rPr>
+        <w:t xml:space="preserve"> de login e </w:t>
+      </w:r>
+      <w:r>
+        <w:rPr>
+          <w:rFonts w:ascii="Arial" w:hAnsi="Arial" w:eastAsia="Arial" w:cs="Arial"/>
+          <w:noProof w:val="0"/>
+          <w:sz w:val="22"/>
+          <w:szCs w:val="22"/>
+          <w:lang w:val="en-US"/>
+        </w:rPr>
+        <w:t>cadastro</w:t>
+      </w:r>
+      <w:r>
+        <w:rPr>
+          <w:rFonts w:ascii="Arial" w:hAnsi="Arial" w:eastAsia="Arial" w:cs="Arial"/>
+          <w:noProof w:val="0"/>
+          <w:sz w:val="22"/>
+          <w:szCs w:val="22"/>
+          <w:lang w:val="en-US"/>
+        </w:rPr>
+        <w:t xml:space="preserve"> </w:t>
+      </w:r>
+    </w:p>
+    <w:p>
+      <w:pPr>
+        <w:pStyle w:val="ListParagraph"/>
+        <w:numPr>
+          <w:ilvl w:val="0"/>
+          <w:numId w:val="9"/>
+        </w:numPr>
+        <w:spacing w:before="0" w:beforeAutospacing="off" w:after="0" w:afterAutospacing="off"/>
+        <w:rPr>
+          <w:rFonts w:ascii="Arial" w:hAnsi="Arial" w:eastAsia="Arial" w:cs="Arial"/>
+          <w:noProof w:val="0"/>
+          <w:sz w:val="22"/>
+          <w:szCs w:val="22"/>
+          <w:lang w:val="en-US"/>
+        </w:rPr>
+      </w:pPr>
+      <w:r>
+        <w:rPr>
+          <w:rFonts w:ascii="Arial" w:hAnsi="Arial" w:eastAsia="Arial" w:cs="Arial"/>
+          <w:noProof w:val="0"/>
+          <w:sz w:val="22"/>
+          <w:szCs w:val="22"/>
+          <w:lang w:val="en-US"/>
+        </w:rPr>
+        <w:t>Estilização</w:t>
+      </w:r>
+      <w:r>
+        <w:rPr>
+          <w:rFonts w:ascii="Arial" w:hAnsi="Arial" w:eastAsia="Arial" w:cs="Arial"/>
+          <w:noProof w:val="0"/>
+          <w:sz w:val="22"/>
+          <w:szCs w:val="22"/>
+          <w:lang w:val="en-US"/>
+        </w:rPr>
+        <w:t xml:space="preserve"> básica</w:t>
+      </w:r>
+      <w:r>
+        <w:rPr>
+          <w:rFonts w:ascii="Arial" w:hAnsi="Arial" w:eastAsia="Arial" w:cs="Arial"/>
+          <w:noProof w:val="0"/>
+          <w:sz w:val="22"/>
+          <w:szCs w:val="22"/>
+          <w:lang w:val="en-US"/>
+        </w:rPr>
+        <w:t xml:space="preserve"> com CSS</w:t>
+      </w:r>
+      <w:r>
+        <w:rPr>
+          <w:rFonts w:ascii="Arial" w:hAnsi="Arial" w:eastAsia="Arial" w:cs="Arial"/>
+          <w:noProof w:val="0"/>
+          <w:sz w:val="22"/>
+          <w:szCs w:val="22"/>
+          <w:lang w:val="en-US"/>
+        </w:rPr>
+        <w:t xml:space="preserve"> da</w:t>
+      </w:r>
+      <w:r>
+        <w:rPr>
+          <w:rFonts w:ascii="Arial" w:hAnsi="Arial" w:eastAsia="Arial" w:cs="Arial"/>
+          <w:noProof w:val="0"/>
+          <w:sz w:val="22"/>
+          <w:szCs w:val="22"/>
+          <w:lang w:val="en-US"/>
+        </w:rPr>
+        <w:t xml:space="preserve"> págin</w:t>
+      </w:r>
+      <w:r>
+        <w:rPr>
+          <w:rFonts w:ascii="Arial" w:hAnsi="Arial" w:eastAsia="Arial" w:cs="Arial"/>
+          <w:noProof w:val="0"/>
+          <w:sz w:val="22"/>
+          <w:szCs w:val="22"/>
+          <w:lang w:val="en-US"/>
+        </w:rPr>
+        <w:t>a</w:t>
+      </w:r>
+      <w:r>
+        <w:rPr>
+          <w:rFonts w:ascii="Arial" w:hAnsi="Arial" w:eastAsia="Arial" w:cs="Arial"/>
+          <w:noProof w:val="0"/>
+          <w:sz w:val="22"/>
+          <w:szCs w:val="22"/>
+          <w:lang w:val="en-US"/>
+        </w:rPr>
+        <w:t xml:space="preserve"> inicia</w:t>
+      </w:r>
+      <w:r>
+        <w:rPr>
+          <w:rFonts w:ascii="Arial" w:hAnsi="Arial" w:eastAsia="Arial" w:cs="Arial"/>
+          <w:noProof w:val="0"/>
+          <w:sz w:val="22"/>
+          <w:szCs w:val="22"/>
+          <w:lang w:val="en-US"/>
+        </w:rPr>
+        <w:t>l</w:t>
+      </w:r>
+      <w:r>
+        <w:rPr>
+          <w:rFonts w:ascii="Arial" w:hAnsi="Arial" w:eastAsia="Arial" w:cs="Arial"/>
+          <w:noProof w:val="0"/>
+          <w:sz w:val="22"/>
+          <w:szCs w:val="22"/>
+          <w:lang w:val="en-US"/>
+        </w:rPr>
+        <w:t xml:space="preserve"> </w:t>
+      </w:r>
+    </w:p>
+    <w:p/>
+    <w:p>
+      <w:pPr>
+        <w:pStyle w:val="Heading2"/>
+        <w:rPr>
+          <w:rFonts w:ascii="Arial" w:hAnsi="Arial" w:eastAsia="Arial" w:cs="Arial"/>
+          <w:noProof w:val="0"/>
+          <w:sz w:val="32"/>
+          <w:szCs w:val="32"/>
+          <w:lang w:val="en-US"/>
+        </w:rPr>
+      </w:pPr>
+      <w:r>
+        <w:rPr>
+          <w:rFonts w:ascii="Arial" w:hAnsi="Arial" w:eastAsia="Arial" w:cs="Arial"/>
+          <w:noProof w:val="0"/>
+          <w:sz w:val="32"/>
+          <w:szCs w:val="32"/>
+          <w:lang w:val="en-US"/>
+        </w:rPr>
+        <w:t>Sprint 3 — Desenvolvimento Back-end</w:t>
+      </w:r>
+    </w:p>
+    <w:p>
+      <w:pPr>
+        <w:pStyle w:val="ListParagraph"/>
+        <w:numPr>
+          <w:ilvl w:val="0"/>
+          <w:numId w:val="10"/>
+        </w:numPr>
+        <w:suppressLineNumbers w:val="0"/>
+        <w:bidi w:val="0"/>
+        <w:spacing w:before="0" w:beforeAutospacing="off" w:after="0" w:afterAutospacing="off" w:line="276" w:lineRule="auto"/>
+        <w:ind w:left="720" w:right="0" w:hanging="360"/>
+        <w:jc w:val="left"/>
+        <w:rPr>
+          <w:rFonts w:ascii="Arial" w:hAnsi="Arial" w:eastAsia="Arial" w:cs="Arial"/>
+          <w:noProof w:val="0"/>
+          <w:sz w:val="22"/>
+          <w:szCs w:val="22"/>
+          <w:lang w:val="en-US"/>
+        </w:rPr>
+      </w:pPr>
+      <w:r>
+        <w:rPr>
+          <w:rFonts w:ascii="Arial" w:hAnsi="Arial" w:eastAsia="Arial" w:cs="Arial"/>
+          <w:noProof w:val="0"/>
+          <w:sz w:val="22"/>
+          <w:szCs w:val="22"/>
+          <w:lang w:val="en-US"/>
+        </w:rPr>
+        <w:t>Estudo</w:t>
+      </w:r>
+      <w:r>
+        <w:rPr>
+          <w:rFonts w:ascii="Arial" w:hAnsi="Arial" w:eastAsia="Arial" w:cs="Arial"/>
+          <w:noProof w:val="0"/>
+          <w:sz w:val="22"/>
+          <w:szCs w:val="22"/>
+          <w:lang w:val="en-US"/>
+        </w:rPr>
+        <w:t xml:space="preserve"> </w:t>
+      </w:r>
+      <w:r>
+        <w:rPr>
+          <w:rFonts w:ascii="Arial" w:hAnsi="Arial" w:eastAsia="Arial" w:cs="Arial"/>
+          <w:noProof w:val="0"/>
+          <w:sz w:val="22"/>
+          <w:szCs w:val="22"/>
+          <w:lang w:val="en-US"/>
+        </w:rPr>
+        <w:t>sobre</w:t>
+      </w:r>
+      <w:r>
+        <w:rPr>
+          <w:rFonts w:ascii="Arial" w:hAnsi="Arial" w:eastAsia="Arial" w:cs="Arial"/>
+          <w:noProof w:val="0"/>
+          <w:sz w:val="22"/>
+          <w:szCs w:val="22"/>
+          <w:lang w:val="en-US"/>
+        </w:rPr>
+        <w:t xml:space="preserve"> </w:t>
+      </w:r>
+      <w:r>
+        <w:rPr>
+          <w:rFonts w:ascii="Arial" w:hAnsi="Arial" w:eastAsia="Arial" w:cs="Arial"/>
+          <w:noProof w:val="0"/>
+          <w:sz w:val="22"/>
+          <w:szCs w:val="22"/>
+          <w:lang w:val="en-US"/>
+        </w:rPr>
+        <w:t>a</w:t>
+      </w:r>
+      <w:r>
+        <w:rPr>
+          <w:rFonts w:ascii="Arial" w:hAnsi="Arial" w:eastAsia="Arial" w:cs="Arial"/>
+          <w:noProof w:val="0"/>
+          <w:sz w:val="22"/>
+          <w:szCs w:val="22"/>
+          <w:lang w:val="en-US"/>
+        </w:rPr>
+        <w:t xml:space="preserve"> </w:t>
+      </w:r>
+      <w:r>
+        <w:rPr>
+          <w:rFonts w:ascii="Arial" w:hAnsi="Arial" w:eastAsia="Arial" w:cs="Arial"/>
+          <w:noProof w:val="0"/>
+          <w:sz w:val="22"/>
+          <w:szCs w:val="22"/>
+          <w:lang w:val="en-US"/>
+        </w:rPr>
+        <w:t>estrutura</w:t>
+      </w:r>
+      <w:r>
+        <w:rPr>
+          <w:rFonts w:ascii="Arial" w:hAnsi="Arial" w:eastAsia="Arial" w:cs="Arial"/>
+          <w:noProof w:val="0"/>
+          <w:sz w:val="22"/>
+          <w:szCs w:val="22"/>
+          <w:lang w:val="en-US"/>
+        </w:rPr>
+        <w:t xml:space="preserve"> do web-data-viz</w:t>
+      </w:r>
+    </w:p>
+    <w:p>
+      <w:pPr>
+        <w:pStyle w:val="ListParagraph"/>
+        <w:numPr>
+          <w:ilvl w:val="0"/>
+          <w:numId w:val="10"/>
+        </w:numPr>
+        <w:spacing w:before="0" w:beforeAutospacing="off" w:after="0" w:afterAutospacing="off"/>
+        <w:rPr>
+          <w:rFonts w:ascii="Arial" w:hAnsi="Arial" w:eastAsia="Arial" w:cs="Arial"/>
+          <w:noProof w:val="0"/>
+          <w:sz w:val="22"/>
+          <w:szCs w:val="22"/>
+          <w:lang w:val="en-US"/>
+        </w:rPr>
+      </w:pPr>
+      <w:r>
+        <w:rPr>
+          <w:rFonts w:ascii="Arial" w:hAnsi="Arial" w:eastAsia="Arial" w:cs="Arial"/>
+          <w:noProof w:val="0"/>
+          <w:sz w:val="22"/>
+          <w:szCs w:val="22"/>
+          <w:lang w:val="en-US"/>
+        </w:rPr>
+        <w:t xml:space="preserve">Integração com MySQL </w:t>
+      </w:r>
+    </w:p>
+    <w:p>
+      <w:pPr>
+        <w:pStyle w:val="ListParagraph"/>
+        <w:numPr>
+          <w:ilvl w:val="0"/>
+          <w:numId w:val="10"/>
+        </w:numPr>
+        <w:spacing w:before="0" w:beforeAutospacing="off" w:after="0" w:afterAutospacing="off"/>
+        <w:rPr>
+          <w:rFonts w:ascii="Arial" w:hAnsi="Arial" w:eastAsia="Arial" w:cs="Arial"/>
+          <w:noProof w:val="0"/>
+          <w:sz w:val="22"/>
+          <w:szCs w:val="22"/>
+          <w:lang w:val="en-US"/>
+        </w:rPr>
+      </w:pPr>
+      <w:r>
+        <w:rPr>
+          <w:rFonts w:ascii="Arial" w:hAnsi="Arial" w:eastAsia="Arial" w:cs="Arial"/>
+          <w:noProof w:val="0"/>
+          <w:sz w:val="22"/>
+          <w:szCs w:val="22"/>
+          <w:lang w:val="en-US"/>
+        </w:rPr>
+        <w:t>Configuração</w:t>
+      </w:r>
+      <w:r>
+        <w:rPr>
+          <w:rFonts w:ascii="Arial" w:hAnsi="Arial" w:eastAsia="Arial" w:cs="Arial"/>
+          <w:noProof w:val="0"/>
+          <w:sz w:val="22"/>
+          <w:szCs w:val="22"/>
+          <w:lang w:val="en-US"/>
+        </w:rPr>
+        <w:t xml:space="preserve"> do Model, Controller e Router</w:t>
+      </w:r>
+    </w:p>
+    <w:p>
+      <w:pPr>
+        <w:pStyle w:val="ListParagraph"/>
+        <w:numPr>
+          <w:ilvl w:val="0"/>
+          <w:numId w:val="10"/>
+        </w:numPr>
+        <w:spacing w:before="0" w:beforeAutospacing="off" w:after="0" w:afterAutospacing="off"/>
+        <w:rPr>
+          <w:rFonts w:ascii="Arial" w:hAnsi="Arial" w:eastAsia="Arial" w:cs="Arial"/>
+          <w:noProof w:val="0"/>
+          <w:sz w:val="22"/>
+          <w:szCs w:val="22"/>
+          <w:lang w:val="en-US"/>
+        </w:rPr>
+      </w:pPr>
+      <w:r>
+        <w:rPr>
+          <w:rFonts w:ascii="Arial" w:hAnsi="Arial" w:eastAsia="Arial" w:cs="Arial"/>
+          <w:noProof w:val="0"/>
+          <w:sz w:val="22"/>
+          <w:szCs w:val="22"/>
+          <w:lang w:val="en-US"/>
+        </w:rPr>
+        <w:t xml:space="preserve">Implementação da lógica dos quizzes </w:t>
+      </w:r>
+    </w:p>
+    <w:p/>
+    <w:p>
+      <w:pPr>
+        <w:pStyle w:val="Heading2"/>
+        <w:rPr>
+          <w:rFonts w:ascii="Arial" w:hAnsi="Arial" w:eastAsia="Arial" w:cs="Arial"/>
+          <w:noProof w:val="0"/>
+          <w:sz w:val="32"/>
+          <w:szCs w:val="32"/>
+          <w:lang w:val="en-US"/>
+        </w:rPr>
+      </w:pPr>
+      <w:r>
+        <w:rPr>
+          <w:rFonts w:ascii="Arial" w:hAnsi="Arial" w:eastAsia="Arial" w:cs="Arial"/>
+          <w:noProof w:val="0"/>
+          <w:sz w:val="32"/>
+          <w:szCs w:val="32"/>
+          <w:lang w:val="en-US"/>
+        </w:rPr>
+        <w:t>Sprint 4 — Dashboard e Gráficos</w:t>
+      </w:r>
+    </w:p>
+    <w:p>
+      <w:pPr>
+        <w:pStyle w:val="ListParagraph"/>
+        <w:numPr>
+          <w:ilvl w:val="0"/>
+          <w:numId w:val="11"/>
+        </w:numPr>
+        <w:spacing w:before="0" w:beforeAutospacing="off" w:after="0" w:afterAutospacing="off"/>
+        <w:rPr>
+          <w:rFonts w:ascii="Arial" w:hAnsi="Arial" w:eastAsia="Arial" w:cs="Arial"/>
+          <w:noProof w:val="0"/>
+          <w:sz w:val="22"/>
+          <w:szCs w:val="22"/>
+          <w:lang w:val="en-US"/>
+        </w:rPr>
+      </w:pPr>
+      <w:r>
+        <w:rPr>
+          <w:rFonts w:ascii="Arial" w:hAnsi="Arial" w:eastAsia="Arial" w:cs="Arial"/>
+          <w:noProof w:val="0"/>
+          <w:sz w:val="22"/>
+          <w:szCs w:val="22"/>
+          <w:lang w:val="en-US"/>
+        </w:rPr>
+        <w:t xml:space="preserve">Desenvolvimento das KPIs </w:t>
+      </w:r>
+    </w:p>
+    <w:p>
+      <w:pPr>
+        <w:pStyle w:val="ListParagraph"/>
+        <w:numPr>
+          <w:ilvl w:val="0"/>
+          <w:numId w:val="11"/>
+        </w:numPr>
+        <w:spacing w:before="0" w:beforeAutospacing="off" w:after="0" w:afterAutospacing="off"/>
+        <w:rPr>
+          <w:rFonts w:ascii="Arial" w:hAnsi="Arial" w:eastAsia="Arial" w:cs="Arial"/>
+          <w:noProof w:val="0"/>
+          <w:sz w:val="22"/>
+          <w:szCs w:val="22"/>
+          <w:lang w:val="en-US"/>
+        </w:rPr>
+      </w:pPr>
+      <w:r>
+        <w:rPr>
+          <w:rFonts w:ascii="Arial" w:hAnsi="Arial" w:eastAsia="Arial" w:cs="Arial"/>
+          <w:noProof w:val="0"/>
+          <w:sz w:val="22"/>
+          <w:szCs w:val="22"/>
+          <w:lang w:val="en-US"/>
+        </w:rPr>
+        <w:t xml:space="preserve">Implementação dos gráficos com Chart.js </w:t>
+      </w:r>
+    </w:p>
+    <w:p>
+      <w:pPr>
+        <w:pStyle w:val="ListParagraph"/>
+        <w:numPr>
+          <w:ilvl w:val="0"/>
+          <w:numId w:val="11"/>
+        </w:numPr>
+        <w:spacing w:before="0" w:beforeAutospacing="off" w:after="0" w:afterAutospacing="off"/>
+        <w:rPr>
+          <w:rFonts w:ascii="Arial" w:hAnsi="Arial" w:eastAsia="Arial" w:cs="Arial"/>
+          <w:noProof w:val="0"/>
+          <w:sz w:val="22"/>
+          <w:szCs w:val="22"/>
+          <w:lang w:val="en-US"/>
+        </w:rPr>
+      </w:pPr>
+      <w:r>
+        <w:rPr>
+          <w:rFonts w:ascii="Arial" w:hAnsi="Arial" w:eastAsia="Arial" w:cs="Arial"/>
+          <w:noProof w:val="0"/>
+          <w:sz w:val="22"/>
+          <w:szCs w:val="22"/>
+          <w:lang w:val="en-US"/>
+        </w:rPr>
+        <w:t xml:space="preserve">Criação dos filtros por dificuldade </w:t>
+      </w:r>
+    </w:p>
+    <w:p>
+      <w:pPr>
+        <w:pStyle w:val="ListParagraph"/>
+        <w:numPr>
+          <w:ilvl w:val="0"/>
+          <w:numId w:val="11"/>
+        </w:numPr>
+        <w:spacing w:before="0" w:beforeAutospacing="off" w:after="0" w:afterAutospacing="off"/>
+        <w:rPr>
+          <w:rFonts w:ascii="Arial" w:hAnsi="Arial" w:eastAsia="Arial" w:cs="Arial"/>
+          <w:noProof w:val="0"/>
+          <w:sz w:val="22"/>
+          <w:szCs w:val="22"/>
+          <w:lang w:val="en-US"/>
+        </w:rPr>
+      </w:pPr>
+      <w:r>
+        <w:rPr>
+          <w:rFonts w:ascii="Arial" w:hAnsi="Arial" w:eastAsia="Arial" w:cs="Arial"/>
+          <w:noProof w:val="0"/>
+          <w:sz w:val="22"/>
+          <w:szCs w:val="22"/>
+          <w:lang w:val="en-US"/>
+        </w:rPr>
+        <w:t xml:space="preserve">Sistema de análise de respostas </w:t>
+      </w:r>
+    </w:p>
+    <w:p>
+      <w:pPr>
+        <w:pStyle w:val="ListParagraph"/>
+        <w:numPr>
+          <w:ilvl w:val="0"/>
+          <w:numId w:val="11"/>
+        </w:numPr>
+        <w:spacing w:before="0" w:beforeAutospacing="off" w:after="0" w:afterAutospacing="off"/>
+        <w:rPr>
+          <w:rFonts w:ascii="Arial" w:hAnsi="Arial" w:eastAsia="Arial" w:cs="Arial"/>
+          <w:noProof w:val="0"/>
+          <w:sz w:val="22"/>
+          <w:szCs w:val="22"/>
+          <w:lang w:val="en-US"/>
+        </w:rPr>
+      </w:pPr>
+      <w:r>
+        <w:rPr>
+          <w:rFonts w:ascii="Arial" w:hAnsi="Arial" w:eastAsia="Arial" w:cs="Arial"/>
+          <w:noProof w:val="0"/>
+          <w:sz w:val="22"/>
+          <w:szCs w:val="22"/>
+          <w:lang w:val="en-US"/>
+        </w:rPr>
+        <w:t xml:space="preserve">Tratamento de erros e validações </w:t>
+      </w:r>
+    </w:p>
+    <w:p/>
+    <w:p>
+      <w:pPr>
+        <w:pStyle w:val="Heading2"/>
+        <w:rPr>
+          <w:rFonts w:ascii="Arial" w:hAnsi="Arial" w:eastAsia="Arial" w:cs="Arial"/>
+          <w:noProof w:val="0"/>
+          <w:sz w:val="32"/>
+          <w:szCs w:val="32"/>
+          <w:lang w:val="en-US"/>
+        </w:rPr>
+      </w:pPr>
+      <w:r>
+        <w:rPr>
+          <w:rFonts w:ascii="Arial" w:hAnsi="Arial" w:eastAsia="Arial" w:cs="Arial"/>
+          <w:noProof w:val="0"/>
+          <w:sz w:val="32"/>
+          <w:szCs w:val="32"/>
+          <w:lang w:val="en-US"/>
+        </w:rPr>
+        <w:t>Sprint 5 — Testes e Refinamento</w:t>
+      </w:r>
+    </w:p>
+    <w:p>
+      <w:pPr>
+        <w:pStyle w:val="ListParagraph"/>
+        <w:numPr>
+          <w:ilvl w:val="0"/>
+          <w:numId w:val="12"/>
+        </w:numPr>
+        <w:spacing w:before="0" w:beforeAutospacing="off" w:after="0" w:afterAutospacing="off"/>
+        <w:rPr>
+          <w:rFonts w:ascii="Arial" w:hAnsi="Arial" w:eastAsia="Arial" w:cs="Arial"/>
+          <w:noProof w:val="0"/>
+          <w:sz w:val="22"/>
+          <w:szCs w:val="22"/>
+          <w:lang w:val="en-US"/>
+        </w:rPr>
+      </w:pPr>
+      <w:r>
+        <w:rPr>
+          <w:rFonts w:ascii="Arial" w:hAnsi="Arial" w:eastAsia="Arial" w:cs="Arial"/>
+          <w:noProof w:val="0"/>
+          <w:sz w:val="22"/>
+          <w:szCs w:val="22"/>
+          <w:lang w:val="en-US"/>
+        </w:rPr>
+        <w:t>Correção</w:t>
+      </w:r>
+      <w:r>
+        <w:rPr>
+          <w:rFonts w:ascii="Arial" w:hAnsi="Arial" w:eastAsia="Arial" w:cs="Arial"/>
+          <w:noProof w:val="0"/>
+          <w:sz w:val="22"/>
+          <w:szCs w:val="22"/>
+          <w:lang w:val="en-US"/>
+        </w:rPr>
+        <w:t xml:space="preserve"> de b</w:t>
+      </w:r>
+      <w:r>
+        <w:rPr>
+          <w:rFonts w:ascii="Arial" w:hAnsi="Arial" w:eastAsia="Arial" w:cs="Arial"/>
+          <w:noProof w:val="0"/>
+          <w:sz w:val="22"/>
+          <w:szCs w:val="22"/>
+          <w:lang w:val="en-US"/>
+        </w:rPr>
+        <w:t>ugs</w:t>
+      </w:r>
+      <w:r>
+        <w:rPr>
+          <w:rFonts w:ascii="Arial" w:hAnsi="Arial" w:eastAsia="Arial" w:cs="Arial"/>
+          <w:noProof w:val="0"/>
+          <w:sz w:val="22"/>
+          <w:szCs w:val="22"/>
+          <w:lang w:val="en-US"/>
+        </w:rPr>
+        <w:t xml:space="preserve"> </w:t>
+      </w:r>
+    </w:p>
+    <w:p>
+      <w:pPr>
+        <w:pStyle w:val="ListParagraph"/>
+        <w:numPr>
+          <w:ilvl w:val="0"/>
+          <w:numId w:val="12"/>
+        </w:numPr>
+        <w:spacing w:before="0" w:beforeAutospacing="off" w:after="0" w:afterAutospacing="off"/>
+        <w:rPr>
+          <w:rFonts w:ascii="Arial" w:hAnsi="Arial" w:eastAsia="Arial" w:cs="Arial"/>
+          <w:noProof w:val="0"/>
+          <w:sz w:val="22"/>
+          <w:szCs w:val="22"/>
+          <w:lang w:val="en-US"/>
+        </w:rPr>
+      </w:pPr>
+      <w:r>
+        <w:rPr>
+          <w:rFonts w:ascii="Arial" w:hAnsi="Arial" w:eastAsia="Arial" w:cs="Arial"/>
+          <w:noProof w:val="0"/>
+          <w:sz w:val="22"/>
+          <w:szCs w:val="22"/>
+          <w:lang w:val="en-US"/>
+        </w:rPr>
+        <w:t xml:space="preserve">Ajustes visuais </w:t>
+      </w:r>
+    </w:p>
+    <w:p>
+      <w:pPr>
+        <w:pStyle w:val="ListParagraph"/>
+        <w:numPr>
+          <w:ilvl w:val="0"/>
+          <w:numId w:val="12"/>
+        </w:numPr>
+        <w:spacing w:before="0" w:beforeAutospacing="off" w:after="0" w:afterAutospacing="off"/>
+        <w:rPr>
+          <w:rFonts w:ascii="Arial" w:hAnsi="Arial" w:eastAsia="Arial" w:cs="Arial"/>
+          <w:noProof w:val="0"/>
+          <w:sz w:val="22"/>
+          <w:szCs w:val="22"/>
+          <w:lang w:val="en-US"/>
+        </w:rPr>
+      </w:pPr>
+      <w:r>
+        <w:rPr>
+          <w:rFonts w:ascii="Arial" w:hAnsi="Arial" w:eastAsia="Arial" w:cs="Arial"/>
+          <w:noProof w:val="0"/>
+          <w:sz w:val="22"/>
+          <w:szCs w:val="22"/>
+          <w:lang w:val="en-US"/>
+        </w:rPr>
+        <w:t xml:space="preserve">Melhorias de desempenho </w:t>
+      </w:r>
+    </w:p>
+    <w:p>
+      <w:pPr>
+        <w:pStyle w:val="ListParagraph"/>
+        <w:numPr>
+          <w:ilvl w:val="0"/>
+          <w:numId w:val="12"/>
+        </w:numPr>
+        <w:spacing w:before="0" w:beforeAutospacing="off" w:after="0" w:afterAutospacing="off"/>
+        <w:rPr>
+          <w:rFonts w:ascii="Arial" w:hAnsi="Arial" w:eastAsia="Arial" w:cs="Arial"/>
+          <w:noProof w:val="0"/>
+          <w:sz w:val="22"/>
+          <w:szCs w:val="22"/>
+          <w:lang w:val="en-US"/>
+        </w:rPr>
+      </w:pPr>
+      <w:r>
+        <w:rPr>
+          <w:rFonts w:ascii="Arial" w:hAnsi="Arial" w:eastAsia="Arial" w:cs="Arial"/>
+          <w:noProof w:val="0"/>
+          <w:sz w:val="22"/>
+          <w:szCs w:val="22"/>
+          <w:lang w:val="en-US"/>
+        </w:rPr>
+        <w:t>Revisão</w:t>
+      </w:r>
+      <w:r>
+        <w:rPr>
+          <w:rFonts w:ascii="Arial" w:hAnsi="Arial" w:eastAsia="Arial" w:cs="Arial"/>
+          <w:noProof w:val="0"/>
+          <w:sz w:val="22"/>
+          <w:szCs w:val="22"/>
+          <w:lang w:val="en-US"/>
+        </w:rPr>
+        <w:t xml:space="preserve"> </w:t>
+      </w:r>
+      <w:r>
+        <w:rPr>
+          <w:rFonts w:ascii="Arial" w:hAnsi="Arial" w:eastAsia="Arial" w:cs="Arial"/>
+          <w:noProof w:val="0"/>
+          <w:sz w:val="22"/>
+          <w:szCs w:val="22"/>
+          <w:lang w:val="en-US"/>
+        </w:rPr>
+        <w:t xml:space="preserve">da </w:t>
+      </w:r>
+      <w:r>
+        <w:rPr>
+          <w:rFonts w:ascii="Arial" w:hAnsi="Arial" w:eastAsia="Arial" w:cs="Arial"/>
+          <w:noProof w:val="0"/>
+          <w:sz w:val="22"/>
+          <w:szCs w:val="22"/>
+          <w:lang w:val="en-US"/>
+        </w:rPr>
+        <w:t>lógica</w:t>
+      </w:r>
+      <w:r>
+        <w:rPr>
+          <w:rFonts w:ascii="Arial" w:hAnsi="Arial" w:eastAsia="Arial" w:cs="Arial"/>
+          <w:noProof w:val="0"/>
+          <w:sz w:val="22"/>
+          <w:szCs w:val="22"/>
+          <w:lang w:val="en-US"/>
+        </w:rPr>
+        <w:t xml:space="preserve"> </w:t>
+      </w:r>
+      <w:r>
+        <w:rPr>
+          <w:rFonts w:ascii="Arial" w:hAnsi="Arial" w:eastAsia="Arial" w:cs="Arial"/>
+          <w:noProof w:val="0"/>
+          <w:sz w:val="22"/>
+          <w:szCs w:val="22"/>
+          <w:lang w:val="en-US"/>
+        </w:rPr>
+        <w:t xml:space="preserve">do </w:t>
+      </w:r>
+      <w:r>
+        <w:rPr>
+          <w:rFonts w:ascii="Arial" w:hAnsi="Arial" w:eastAsia="Arial" w:cs="Arial"/>
+          <w:noProof w:val="0"/>
+          <w:sz w:val="22"/>
+          <w:szCs w:val="22"/>
+          <w:lang w:val="en-US"/>
+        </w:rPr>
+        <w:t>sistema</w:t>
+      </w:r>
+      <w:r>
+        <w:rPr>
+          <w:rFonts w:ascii="Arial" w:hAnsi="Arial" w:eastAsia="Arial" w:cs="Arial"/>
+          <w:noProof w:val="0"/>
+          <w:sz w:val="22"/>
+          <w:szCs w:val="22"/>
+          <w:lang w:val="en-US"/>
+        </w:rPr>
+        <w:t xml:space="preserve"> </w:t>
+      </w:r>
+    </w:p>
+    <w:p>
+      <w:pPr>
+        <w:pStyle w:val="ListParagraph"/>
+        <w:numPr>
+          <w:ilvl w:val="0"/>
+          <w:numId w:val="12"/>
+        </w:numPr>
+        <w:spacing w:before="0" w:beforeAutospacing="off" w:after="0" w:afterAutospacing="off"/>
+        <w:rPr>
+          <w:rFonts w:ascii="Arial" w:hAnsi="Arial" w:eastAsia="Arial" w:cs="Arial"/>
+          <w:noProof w:val="0"/>
+          <w:sz w:val="22"/>
+          <w:szCs w:val="22"/>
+          <w:lang w:val="en-US"/>
+        </w:rPr>
+      </w:pPr>
+      <w:r>
+        <w:rPr>
+          <w:rFonts w:ascii="Arial" w:hAnsi="Arial" w:eastAsia="Arial" w:cs="Arial"/>
+          <w:noProof w:val="0"/>
+          <w:sz w:val="22"/>
+          <w:szCs w:val="22"/>
+          <w:lang w:val="en-US"/>
+        </w:rPr>
+        <w:t>Criação</w:t>
+      </w:r>
+      <w:r>
+        <w:rPr>
+          <w:rFonts w:ascii="Arial" w:hAnsi="Arial" w:eastAsia="Arial" w:cs="Arial"/>
+          <w:noProof w:val="0"/>
+          <w:sz w:val="22"/>
+          <w:szCs w:val="22"/>
+          <w:lang w:val="en-US"/>
+        </w:rPr>
+        <w:t xml:space="preserve"> do PPT (Power Point)</w:t>
+      </w:r>
+    </w:p>
+    <w:p/>
+    <w:p>
+      <w:pPr>
+        <w:pStyle w:val="Heading2"/>
+        <w:rPr>
+          <w:rFonts w:ascii="Arial" w:hAnsi="Arial" w:eastAsia="Arial" w:cs="Arial"/>
+          <w:noProof w:val="0"/>
+          <w:sz w:val="32"/>
+          <w:szCs w:val="32"/>
+          <w:lang w:val="en-US"/>
+        </w:rPr>
+      </w:pPr>
+      <w:r>
+        <w:rPr>
+          <w:rFonts w:ascii="Arial" w:hAnsi="Arial" w:eastAsia="Arial" w:cs="Arial"/>
+          <w:noProof w:val="0"/>
+          <w:sz w:val="32"/>
+          <w:szCs w:val="32"/>
+          <w:lang w:val="en-US"/>
+        </w:rPr>
+        <w:t>Sprint 6 — Documentação e Entrega</w:t>
+      </w:r>
+    </w:p>
+    <w:p>
+      <w:pPr>
+        <w:pStyle w:val="ListParagraph"/>
+        <w:numPr>
+          <w:ilvl w:val="0"/>
+          <w:numId w:val="13"/>
+        </w:numPr>
+        <w:spacing w:before="0" w:beforeAutospacing="off" w:after="0" w:afterAutospacing="off"/>
+        <w:rPr>
+          <w:rFonts w:ascii="Arial" w:hAnsi="Arial" w:eastAsia="Arial" w:cs="Arial"/>
+          <w:noProof w:val="0"/>
+          <w:sz w:val="22"/>
+          <w:szCs w:val="22"/>
+          <w:lang w:val="en-US"/>
+        </w:rPr>
+      </w:pPr>
+      <w:r>
+        <w:rPr>
+          <w:rFonts w:ascii="Arial" w:hAnsi="Arial" w:eastAsia="Arial" w:cs="Arial"/>
+          <w:noProof w:val="0"/>
+          <w:sz w:val="22"/>
+          <w:szCs w:val="22"/>
+          <w:lang w:val="en-US"/>
+        </w:rPr>
+        <w:t>Final</w:t>
+      </w:r>
+      <w:r>
+        <w:rPr>
+          <w:rFonts w:ascii="Arial" w:hAnsi="Arial" w:eastAsia="Arial" w:cs="Arial"/>
+          <w:noProof w:val="0"/>
+          <w:sz w:val="22"/>
+          <w:szCs w:val="22"/>
+          <w:lang w:val="en-US"/>
+        </w:rPr>
+        <w:t xml:space="preserve"> da </w:t>
+      </w:r>
+      <w:r>
+        <w:rPr>
+          <w:rFonts w:ascii="Arial" w:hAnsi="Arial" w:eastAsia="Arial" w:cs="Arial"/>
+          <w:noProof w:val="0"/>
+          <w:sz w:val="22"/>
+          <w:szCs w:val="22"/>
+          <w:lang w:val="en-US"/>
+        </w:rPr>
+        <w:t>documentação</w:t>
+      </w:r>
+      <w:r>
+        <w:rPr>
+          <w:rFonts w:ascii="Arial" w:hAnsi="Arial" w:eastAsia="Arial" w:cs="Arial"/>
+          <w:noProof w:val="0"/>
+          <w:sz w:val="22"/>
+          <w:szCs w:val="22"/>
+          <w:lang w:val="en-US"/>
+        </w:rPr>
+        <w:t xml:space="preserve"> do </w:t>
+      </w:r>
+      <w:r>
+        <w:rPr>
+          <w:rFonts w:ascii="Arial" w:hAnsi="Arial" w:eastAsia="Arial" w:cs="Arial"/>
+          <w:noProof w:val="0"/>
+          <w:sz w:val="22"/>
+          <w:szCs w:val="22"/>
+          <w:lang w:val="en-US"/>
+        </w:rPr>
+        <w:t>projeto</w:t>
+      </w:r>
+      <w:r>
+        <w:rPr>
+          <w:rFonts w:ascii="Arial" w:hAnsi="Arial" w:eastAsia="Arial" w:cs="Arial"/>
+          <w:noProof w:val="0"/>
+          <w:sz w:val="22"/>
+          <w:szCs w:val="22"/>
+          <w:lang w:val="en-US"/>
+        </w:rPr>
+        <w:t xml:space="preserve"> </w:t>
+      </w:r>
+    </w:p>
+    <w:p>
+      <w:pPr>
+        <w:pStyle w:val="ListParagraph"/>
+        <w:numPr>
+          <w:ilvl w:val="0"/>
+          <w:numId w:val="13"/>
+        </w:numPr>
+        <w:spacing w:before="0" w:beforeAutospacing="off" w:after="0" w:afterAutospacing="off"/>
+        <w:rPr>
+          <w:rFonts w:ascii="Arial" w:hAnsi="Arial" w:eastAsia="Arial" w:cs="Arial"/>
+          <w:noProof w:val="0"/>
+          <w:sz w:val="22"/>
+          <w:szCs w:val="22"/>
+          <w:lang w:val="en-US"/>
+        </w:rPr>
+      </w:pPr>
+      <w:r>
+        <w:rPr>
+          <w:rFonts w:ascii="Arial" w:hAnsi="Arial" w:eastAsia="Arial" w:cs="Arial"/>
+          <w:noProof w:val="0"/>
+          <w:sz w:val="22"/>
+          <w:szCs w:val="22"/>
+          <w:lang w:val="en-US"/>
+        </w:rPr>
+        <w:t>Organização</w:t>
+      </w:r>
+      <w:r>
+        <w:rPr>
+          <w:rFonts w:ascii="Arial" w:hAnsi="Arial" w:eastAsia="Arial" w:cs="Arial"/>
+          <w:noProof w:val="0"/>
+          <w:sz w:val="22"/>
+          <w:szCs w:val="22"/>
+          <w:lang w:val="en-US"/>
+        </w:rPr>
+        <w:t xml:space="preserve"> do </w:t>
+      </w:r>
+      <w:r>
+        <w:rPr>
+          <w:rFonts w:ascii="Arial" w:hAnsi="Arial" w:eastAsia="Arial" w:cs="Arial"/>
+          <w:noProof w:val="0"/>
+          <w:sz w:val="22"/>
+          <w:szCs w:val="22"/>
+          <w:lang w:val="en-US"/>
+        </w:rPr>
+        <w:t xml:space="preserve">README no </w:t>
+      </w:r>
+      <w:r>
+        <w:rPr>
+          <w:rFonts w:ascii="Arial" w:hAnsi="Arial" w:eastAsia="Arial" w:cs="Arial"/>
+          <w:noProof w:val="0"/>
+          <w:sz w:val="22"/>
+          <w:szCs w:val="22"/>
+          <w:lang w:val="en-US"/>
+        </w:rPr>
+        <w:t xml:space="preserve">GitHub </w:t>
+      </w:r>
+    </w:p>
+    <w:p>
+      <w:pPr>
+        <w:pStyle w:val="ListParagraph"/>
+        <w:numPr>
+          <w:ilvl w:val="0"/>
+          <w:numId w:val="13"/>
+        </w:numPr>
+        <w:spacing w:before="0" w:beforeAutospacing="off" w:after="0" w:afterAutospacing="off"/>
+        <w:rPr>
+          <w:rFonts w:ascii="Arial" w:hAnsi="Arial" w:eastAsia="Arial" w:cs="Arial"/>
+          <w:noProof w:val="0"/>
+          <w:sz w:val="22"/>
+          <w:szCs w:val="22"/>
+          <w:lang w:val="en-US"/>
+        </w:rPr>
+      </w:pPr>
+      <w:r>
+        <w:rPr>
+          <w:rFonts w:ascii="Arial" w:hAnsi="Arial" w:eastAsia="Arial" w:cs="Arial"/>
+          <w:noProof w:val="0"/>
+          <w:sz w:val="22"/>
+          <w:szCs w:val="22"/>
+          <w:lang w:val="en-US"/>
+        </w:rPr>
+        <w:t xml:space="preserve">Preparação para apresentação </w:t>
+      </w:r>
+    </w:p>
+    <w:p>
+      <w:pPr>
+        <w:pStyle w:val="ListParagraph"/>
+        <w:numPr>
+          <w:ilvl w:val="0"/>
+          <w:numId w:val="13"/>
+        </w:numPr>
+        <w:spacing w:before="0" w:beforeAutospacing="off" w:after="0" w:afterAutospacing="off"/>
+        <w:rPr>
+          <w:rFonts w:ascii="Arial" w:hAnsi="Arial" w:eastAsia="Arial" w:cs="Arial"/>
+          <w:noProof w:val="0"/>
+          <w:sz w:val="22"/>
+          <w:szCs w:val="22"/>
+          <w:lang w:val="en-US"/>
+        </w:rPr>
+      </w:pPr>
+      <w:r>
+        <w:rPr>
+          <w:rFonts w:ascii="Arial" w:hAnsi="Arial" w:eastAsia="Arial" w:cs="Arial"/>
+          <w:noProof w:val="0"/>
+          <w:sz w:val="22"/>
+          <w:szCs w:val="22"/>
+          <w:lang w:val="en-US"/>
+        </w:rPr>
+        <w:t>Finalização do projeto</w:t>
+      </w:r>
+    </w:p>
+    <w:p>
+      <w:pPr>
+        <w:pStyle w:val="Normal"/>
+        <w:rPr>
+          <w:lang w:val="en-US"/>
+        </w:rPr>
+      </w:pPr>
+    </w:p>
+    <w:p>
+      <w:pPr>
+        <w:pStyle w:val="Normal"/>
+        <w:suppressLineNumbers w:val="0"/>
+        <w:bidi w:val="0"/>
+        <w:spacing w:before="0" w:beforeAutospacing="off" w:after="0" w:afterAutospacing="off" w:line="276" w:lineRule="auto"/>
+        <w:ind w:left="0" w:right="0"/>
+        <w:jc w:val="left"/>
+        <w:rPr>
+          <w:lang w:val="en-US"/>
+        </w:rPr>
+      </w:pPr>
+    </w:p>
+    <w:p xmlns:wp14="http://schemas.microsoft.com/office/word/2010/wordml" wp14:textId="77777777">
       <w:pPr>
         <w:pStyle w:val="Heading1"/>
-        <w:rPr>
-          <w:lang w:val="en-US"/>
-        </w:rPr>
-      </w:pPr>
-      <w:r>
-        <w:rPr>
-          <w:lang w:val="en-US"/>
-        </w:rPr>
-        <w:t>Metodologias</w:t>
-      </w:r>
-      <w:r>
-        <w:rPr>
-          <w:lang w:val="en-US"/>
-        </w:rPr>
-        <w:t xml:space="preserve"> Utilizadas</w:t>
-      </w:r>
-    </w:p>
-    <w:p xmlns:wp14="http://schemas.microsoft.com/office/word/2010/wordml" wp14:textId="07F1DCCC">
-      <w:pPr/>
-    </w:p>
-    <w:p xmlns:wp14="http://schemas.microsoft.com/office/word/2010/wordml" wp14:textId="77777777">
-      <w:pPr>
-        <w:pStyle w:val="Heading1"/>
-      </w:pPr>
-      <w:r>
-        <w:rPr/>
+        <w:ind w:left="0"/>
+      </w:pPr>
+      <w:r>
+        <w:rPr>
+          <w:lang w:val="en-US"/>
+        </w:rPr>
         <w:t>Tecnologias Utilizadas</w:t>
       </w:r>
+    </w:p>
+    <w:p>
+      <w:pPr>
+        <w:pStyle w:val="Normal"/>
+        <w:suppressLineNumbers w:val="0"/>
+        <w:bidi w:val="0"/>
+        <w:spacing w:before="0" w:beforeAutospacing="off" w:after="0" w:afterAutospacing="off" w:line="276" w:lineRule="auto"/>
+        <w:ind w:left="0" w:right="0"/>
+        <w:jc w:val="left"/>
+        <w:rPr>
+          <w:lang w:val="en-US"/>
+        </w:rPr>
+      </w:pPr>
     </w:p>
     <w:tbl>
       <w:tblPr>
-        <w:tblStyle w:val="TableGrid"/>
+        <w:tblStyle w:val="GridTable5Dark-Accent1"/>
         <w:tblW w:w="0" w:type="auto"/>
         <w:jc w:val="center"/>
         <w:tblLook w:val="06A0" w:firstRow="1" w:lastRow="0" w:firstColumn="1" w:lastColumn="0" w:noHBand="1" w:noVBand="1"/>
@@ -2308,12 +3869,13 @@
         <w:gridCol w:w="2670"/>
         <w:gridCol w:w="6465"/>
       </w:tblGrid>
-      <w:tr>
+      <w:tr xmlns:wp14="http://schemas.microsoft.com/office/word/2010/wordml" wp14:textId="77777777">
         <w:trPr>
           <w:trHeight w:val="300"/>
         </w:trPr>
         <w:tc>
           <w:tcPr>
+            <w:cnfStyle w:val="001000000000" w:firstRow="0" w:lastRow="0" w:firstColumn="1" w:lastColumn="0" w:oddVBand="0" w:evenVBand="0" w:oddHBand="0" w:evenHBand="0" w:firstRowFirstColumn="0" w:firstRowLastColumn="0" w:lastRowFirstColumn="0" w:lastRowLastColumn="0"/>
             <w:tcW w:w="2670" w:type="dxa"/>
             <w:tcMar/>
           </w:tcPr>
@@ -2330,6 +3892,7 @@
         </w:tc>
         <w:tc>
           <w:tcPr>
+            <w:cnfStyle w:val="000000000000" w:firstRow="0" w:lastRow="0" w:firstColumn="0" w:lastColumn="0" w:oddVBand="0" w:evenVBand="0" w:oddHBand="0" w:evenHBand="0" w:firstRowFirstColumn="0" w:firstRowLastColumn="0" w:lastRowFirstColumn="0" w:lastRowLastColumn="0"/>
             <w:tcW w:w="6465" w:type="dxa"/>
             <w:tcMar/>
           </w:tcPr>
@@ -2349,15 +3912,22 @@
           </w:p>
         </w:tc>
       </w:tr>
-      <w:tr>
+      <w:tr xmlns:wp14="http://schemas.microsoft.com/office/word/2010/wordml" wp14:textId="77777777">
         <w:trPr>
           <w:trHeight w:val="300"/>
         </w:trPr>
         <w:tc>
           <w:tcPr>
+            <w:cnfStyle w:val="001000000000" w:firstRow="0" w:lastRow="0" w:firstColumn="1" w:lastColumn="0" w:oddVBand="0" w:evenVBand="0" w:oddHBand="0" w:evenHBand="0" w:firstRowFirstColumn="0" w:firstRowLastColumn="0" w:lastRowFirstColumn="0" w:lastRowLastColumn="0"/>
             <w:tcW w:w="2670" w:type="dxa"/>
             <w:tcMar/>
           </w:tcPr>
+          <w:p>
+            <w:pPr>
+              <w:pStyle w:val="Normal"/>
+              <w:jc w:val="center"/>
+            </w:pPr>
+          </w:p>
           <w:p>
             <w:pPr>
               <w:pStyle w:val="Normal"/>
@@ -2371,6 +3941,7 @@
         </w:tc>
         <w:tc>
           <w:tcPr>
+            <w:cnfStyle w:val="000000000000" w:firstRow="0" w:lastRow="0" w:firstColumn="0" w:lastColumn="0" w:oddVBand="0" w:evenVBand="0" w:oddHBand="0" w:evenHBand="0" w:firstRowFirstColumn="0" w:firstRowLastColumn="0" w:lastRowFirstColumn="0" w:lastRowLastColumn="0"/>
             <w:tcW w:w="6465" w:type="dxa"/>
             <w:tcMar/>
           </w:tcPr>
@@ -2379,18 +3950,35 @@
               <w:pStyle w:val="Normal"/>
               <w:jc w:val="center"/>
             </w:pPr>
+            <w:r>
+              <w:rPr>
+                <w:rFonts w:ascii="Arial" w:hAnsi="Arial" w:eastAsia="Arial" w:cs="Arial"/>
+                <w:noProof w:val="0"/>
+                <w:sz w:val="22"/>
+                <w:szCs w:val="22"/>
+                <w:lang w:val="pt-BR"/>
+              </w:rPr>
+              <w:t>Utilizado para estruturar todas as páginas do projeto, organizando elementos como dashboard, quizzes, gráficos, botões, formulários e seções informativas do site.</w:t>
+            </w:r>
           </w:p>
         </w:tc>
       </w:tr>
-      <w:tr>
+      <w:tr xmlns:wp14="http://schemas.microsoft.com/office/word/2010/wordml" wp14:textId="77777777">
         <w:trPr>
           <w:trHeight w:val="300"/>
         </w:trPr>
         <w:tc>
           <w:tcPr>
+            <w:cnfStyle w:val="001000000000" w:firstRow="0" w:lastRow="0" w:firstColumn="1" w:lastColumn="0" w:oddVBand="0" w:evenVBand="0" w:oddHBand="0" w:evenHBand="0" w:firstRowFirstColumn="0" w:firstRowLastColumn="0" w:lastRowFirstColumn="0" w:lastRowLastColumn="0"/>
             <w:tcW w:w="2670" w:type="dxa"/>
             <w:tcMar/>
           </w:tcPr>
+          <w:p>
+            <w:pPr>
+              <w:pStyle w:val="Normal"/>
+              <w:jc w:val="center"/>
+            </w:pPr>
+          </w:p>
           <w:p>
             <w:pPr>
               <w:pStyle w:val="Normal"/>
@@ -2404,6 +3992,7 @@
         </w:tc>
         <w:tc>
           <w:tcPr>
+            <w:cnfStyle w:val="000000000000" w:firstRow="0" w:lastRow="0" w:firstColumn="0" w:lastColumn="0" w:oddVBand="0" w:evenVBand="0" w:oddHBand="0" w:evenHBand="0" w:firstRowFirstColumn="0" w:firstRowLastColumn="0" w:lastRowFirstColumn="0" w:lastRowLastColumn="0"/>
             <w:tcW w:w="6465" w:type="dxa"/>
             <w:tcMar/>
           </w:tcPr>
@@ -2412,18 +4001,38 @@
               <w:pStyle w:val="Normal"/>
               <w:jc w:val="center"/>
             </w:pPr>
+            <w:r>
+              <w:rPr>
+                <w:rFonts w:ascii="Arial" w:hAnsi="Arial" w:eastAsia="Arial" w:cs="Arial"/>
+                <w:noProof w:val="0"/>
+                <w:sz w:val="22"/>
+                <w:szCs w:val="22"/>
+                <w:lang w:val="pt-BR"/>
+              </w:rPr>
+              <w:t>Responsável pela estilização visual da aplicação, incluindo layout responsivo, efeitos visuais, animações, sistema glassmorphism, organização dos gráficos e identidade visual inspirada no Rocket League.</w:t>
+            </w:r>
           </w:p>
         </w:tc>
       </w:tr>
-      <w:tr>
+      <w:tr xmlns:wp14="http://schemas.microsoft.com/office/word/2010/wordml" wp14:textId="77777777">
         <w:trPr>
           <w:trHeight w:val="300"/>
         </w:trPr>
         <w:tc>
           <w:tcPr>
+            <w:cnfStyle w:val="001000000000" w:firstRow="0" w:lastRow="0" w:firstColumn="1" w:lastColumn="0" w:oddVBand="0" w:evenVBand="0" w:oddHBand="0" w:evenHBand="0" w:firstRowFirstColumn="0" w:firstRowLastColumn="0" w:lastRowFirstColumn="0" w:lastRowLastColumn="0"/>
             <w:tcW w:w="2670" w:type="dxa"/>
             <w:tcMar/>
           </w:tcPr>
+          <w:p>
+            <w:pPr>
+              <w:pStyle w:val="Normal"/>
+              <w:jc w:val="center"/>
+              <w:rPr>
+                <w:lang w:val="pt-BR"/>
+              </w:rPr>
+            </w:pPr>
+          </w:p>
           <w:p>
             <w:pPr>
               <w:pStyle w:val="Normal"/>
@@ -2442,6 +4051,7 @@
         </w:tc>
         <w:tc>
           <w:tcPr>
+            <w:cnfStyle w:val="000000000000" w:firstRow="0" w:lastRow="0" w:firstColumn="0" w:lastColumn="0" w:oddVBand="0" w:evenVBand="0" w:oddHBand="0" w:evenHBand="0" w:firstRowFirstColumn="0" w:firstRowLastColumn="0" w:lastRowFirstColumn="0" w:lastRowLastColumn="0"/>
             <w:tcW w:w="6465" w:type="dxa"/>
             <w:tcMar/>
           </w:tcPr>
@@ -2450,18 +4060,35 @@
               <w:pStyle w:val="Normal"/>
               <w:jc w:val="center"/>
             </w:pPr>
+            <w:r>
+              <w:rPr>
+                <w:rFonts w:ascii="Arial" w:hAnsi="Arial" w:eastAsia="Arial" w:cs="Arial"/>
+                <w:noProof w:val="0"/>
+                <w:sz w:val="22"/>
+                <w:szCs w:val="22"/>
+                <w:lang w:val="pt-BR"/>
+              </w:rPr>
+              <w:t>Utilizado no desenvolvimento do back-end da aplicação, permitindo criar rotas, controlar requisições, conectar o sistema ao banco de dados e gerenciar as funcionalidades dos quizzes e dashboards.</w:t>
+            </w:r>
           </w:p>
         </w:tc>
       </w:tr>
-      <w:tr>
+      <w:tr xmlns:wp14="http://schemas.microsoft.com/office/word/2010/wordml" wp14:textId="77777777">
         <w:trPr>
           <w:trHeight w:val="300"/>
         </w:trPr>
         <w:tc>
           <w:tcPr>
+            <w:cnfStyle w:val="001000000000" w:firstRow="0" w:lastRow="0" w:firstColumn="1" w:lastColumn="0" w:oddVBand="0" w:evenVBand="0" w:oddHBand="0" w:evenHBand="0" w:firstRowFirstColumn="0" w:firstRowLastColumn="0" w:lastRowFirstColumn="0" w:lastRowLastColumn="0"/>
             <w:tcW w:w="2670" w:type="dxa"/>
             <w:tcMar/>
           </w:tcPr>
+          <w:p>
+            <w:pPr>
+              <w:pStyle w:val="Normal"/>
+              <w:jc w:val="center"/>
+            </w:pPr>
+          </w:p>
           <w:p>
             <w:pPr>
               <w:pStyle w:val="Normal"/>
@@ -2475,6 +4102,7 @@
         </w:tc>
         <w:tc>
           <w:tcPr>
+            <w:cnfStyle w:val="000000000000" w:firstRow="0" w:lastRow="0" w:firstColumn="0" w:lastColumn="0" w:oddVBand="0" w:evenVBand="0" w:oddHBand="0" w:evenHBand="0" w:firstRowFirstColumn="0" w:firstRowLastColumn="0" w:lastRowFirstColumn="0" w:lastRowLastColumn="0"/>
             <w:tcW w:w="6465" w:type="dxa"/>
             <w:tcMar/>
           </w:tcPr>
@@ -2483,18 +4111,38 @@
               <w:pStyle w:val="Normal"/>
               <w:jc w:val="center"/>
             </w:pPr>
+            <w:r>
+              <w:rPr>
+                <w:rFonts w:ascii="Arial" w:hAnsi="Arial" w:eastAsia="Arial" w:cs="Arial"/>
+                <w:noProof w:val="0"/>
+                <w:sz w:val="22"/>
+                <w:szCs w:val="22"/>
+                <w:lang w:val="en-US"/>
+              </w:rPr>
+              <w:t>Banco de dados utilizado para armazenar informações dos usuários, perguntas do quiz, respostas, tentativas realizadas, desempenho e estatísticas exibidas na dashboard.</w:t>
+            </w:r>
           </w:p>
         </w:tc>
       </w:tr>
-      <w:tr>
+      <w:tr xmlns:wp14="http://schemas.microsoft.com/office/word/2010/wordml" wp14:textId="77777777">
         <w:trPr>
           <w:trHeight w:val="300"/>
         </w:trPr>
         <w:tc>
           <w:tcPr>
+            <w:cnfStyle w:val="001000000000" w:firstRow="0" w:lastRow="0" w:firstColumn="1" w:lastColumn="0" w:oddVBand="0" w:evenVBand="0" w:oddHBand="0" w:evenHBand="0" w:firstRowFirstColumn="0" w:firstRowLastColumn="0" w:lastRowFirstColumn="0" w:lastRowLastColumn="0"/>
             <w:tcW w:w="2670" w:type="dxa"/>
             <w:tcMar/>
           </w:tcPr>
+          <w:p>
+            <w:pPr>
+              <w:pStyle w:val="Normal"/>
+              <w:jc w:val="center"/>
+              <w:rPr>
+                <w:lang w:val="pt-BR"/>
+              </w:rPr>
+            </w:pPr>
+          </w:p>
           <w:p>
             <w:pPr>
               <w:pStyle w:val="Normal"/>
@@ -2516,6 +4164,7 @@
         </w:tc>
         <w:tc>
           <w:tcPr>
+            <w:cnfStyle w:val="000000000000" w:firstRow="0" w:lastRow="0" w:firstColumn="0" w:lastColumn="0" w:oddVBand="0" w:evenVBand="0" w:oddHBand="0" w:evenHBand="0" w:firstRowFirstColumn="0" w:firstRowLastColumn="0" w:lastRowFirstColumn="0" w:lastRowLastColumn="0"/>
             <w:tcW w:w="6465" w:type="dxa"/>
             <w:tcMar/>
           </w:tcPr>
@@ -2524,18 +4173,38 @@
               <w:pStyle w:val="Normal"/>
               <w:jc w:val="center"/>
             </w:pPr>
+            <w:r>
+              <w:rPr>
+                <w:rFonts w:ascii="Arial" w:hAnsi="Arial" w:eastAsia="Arial" w:cs="Arial"/>
+                <w:noProof w:val="0"/>
+                <w:sz w:val="22"/>
+                <w:szCs w:val="22"/>
+                <w:lang w:val="en-US"/>
+              </w:rPr>
+              <w:t>Utilizado para executar máquinas virtuais durante o desenvolvimento do projeto, permitindo configurar ambientes isolados para testes e execução do sistema.</w:t>
+            </w:r>
           </w:p>
         </w:tc>
       </w:tr>
-      <w:tr>
+      <w:tr xmlns:wp14="http://schemas.microsoft.com/office/word/2010/wordml" wp14:textId="77777777">
         <w:trPr>
           <w:trHeight w:val="300"/>
         </w:trPr>
         <w:tc>
           <w:tcPr>
+            <w:cnfStyle w:val="001000000000" w:firstRow="0" w:lastRow="0" w:firstColumn="1" w:lastColumn="0" w:oddVBand="0" w:evenVBand="0" w:oddHBand="0" w:evenHBand="0" w:firstRowFirstColumn="0" w:firstRowLastColumn="0" w:lastRowFirstColumn="0" w:lastRowLastColumn="0"/>
             <w:tcW w:w="2670" w:type="dxa"/>
             <w:tcMar/>
           </w:tcPr>
+          <w:p>
+            <w:pPr>
+              <w:pStyle w:val="Normal"/>
+              <w:jc w:val="center"/>
+              <w:rPr>
+                <w:lang w:val="pt-BR"/>
+              </w:rPr>
+            </w:pPr>
+          </w:p>
           <w:p>
             <w:pPr>
               <w:pStyle w:val="Normal"/>
@@ -2551,6 +4220,7 @@
         </w:tc>
         <w:tc>
           <w:tcPr>
+            <w:cnfStyle w:val="000000000000" w:firstRow="0" w:lastRow="0" w:firstColumn="0" w:lastColumn="0" w:oddVBand="0" w:evenVBand="0" w:oddHBand="0" w:evenHBand="0" w:firstRowFirstColumn="0" w:firstRowLastColumn="0" w:lastRowFirstColumn="0" w:lastRowLastColumn="0"/>
             <w:tcW w:w="6465" w:type="dxa"/>
             <w:tcMar/>
           </w:tcPr>
@@ -2559,18 +4229,38 @@
               <w:pStyle w:val="Normal"/>
               <w:jc w:val="center"/>
             </w:pPr>
+            <w:r>
+              <w:rPr>
+                <w:rFonts w:ascii="Arial" w:hAnsi="Arial" w:eastAsia="Arial" w:cs="Arial"/>
+                <w:noProof w:val="0"/>
+                <w:sz w:val="22"/>
+                <w:szCs w:val="22"/>
+                <w:lang w:val="en-US"/>
+              </w:rPr>
+              <w:t>Plataforma utilizada para versionamento do código-fonte, armazenamento do projeto em nuvem e controle das alterações realizadas durante o desenvolvimento.</w:t>
+            </w:r>
           </w:p>
         </w:tc>
       </w:tr>
-      <w:tr>
+      <w:tr xmlns:wp14="http://schemas.microsoft.com/office/word/2010/wordml" wp14:textId="77777777">
         <w:trPr>
           <w:trHeight w:val="300"/>
         </w:trPr>
         <w:tc>
           <w:tcPr>
+            <w:cnfStyle w:val="001000000000" w:firstRow="0" w:lastRow="0" w:firstColumn="1" w:lastColumn="0" w:oddVBand="0" w:evenVBand="0" w:oddHBand="0" w:evenHBand="0" w:firstRowFirstColumn="0" w:firstRowLastColumn="0" w:lastRowFirstColumn="0" w:lastRowLastColumn="0"/>
             <w:tcW w:w="2670" w:type="dxa"/>
             <w:tcMar/>
           </w:tcPr>
+          <w:p>
+            <w:pPr>
+              <w:pStyle w:val="Normal"/>
+              <w:jc w:val="center"/>
+              <w:rPr>
+                <w:lang w:val="pt-BR"/>
+              </w:rPr>
+            </w:pPr>
+          </w:p>
           <w:p>
             <w:pPr>
               <w:pStyle w:val="Normal"/>
@@ -2586,6 +4276,7 @@
         </w:tc>
         <w:tc>
           <w:tcPr>
+            <w:cnfStyle w:val="000000000000" w:firstRow="0" w:lastRow="0" w:firstColumn="0" w:lastColumn="0" w:oddVBand="0" w:evenVBand="0" w:oddHBand="0" w:evenHBand="0" w:firstRowFirstColumn="0" w:firstRowLastColumn="0" w:lastRowFirstColumn="0" w:lastRowLastColumn="0"/>
             <w:tcW w:w="6465" w:type="dxa"/>
             <w:tcMar/>
           </w:tcPr>
@@ -2594,6 +4285,16 @@
               <w:pStyle w:val="Normal"/>
               <w:jc w:val="center"/>
             </w:pPr>
+            <w:r>
+              <w:rPr>
+                <w:rFonts w:ascii="Arial" w:hAnsi="Arial" w:eastAsia="Arial" w:cs="Arial"/>
+                <w:noProof w:val="0"/>
+                <w:sz w:val="22"/>
+                <w:szCs w:val="22"/>
+                <w:lang w:val="en-US"/>
+              </w:rPr>
+              <w:t>Ferramenta utilizada para organização das tarefas do projeto, planejamento das etapas de desenvolvimento e acompanhamento das funcionalidades implementadas.</w:t>
+            </w:r>
           </w:p>
         </w:tc>
       </w:tr>
@@ -2622,6 +4323,678 @@
 
 <file path=word/numbering.xml><?xml version="1.0" encoding="utf-8"?>
 <w:numbering xmlns:mc="http://schemas.openxmlformats.org/markup-compatibility/2006" xmlns:o="urn:schemas-microsoft-com:office:office" xmlns:r="http://schemas.openxmlformats.org/officeDocument/2006/relationships" xmlns:m="http://schemas.openxmlformats.org/officeDocument/2006/math" xmlns:v="urn:schemas-microsoft-com:vml" xmlns:wp="http://schemas.openxmlformats.org/drawingml/2006/wordprocessingDrawing" xmlns:w10="urn:schemas-microsoft-com:office:word" xmlns:w="http://schemas.openxmlformats.org/wordprocessingml/2006/main" xmlns:wne="http://schemas.microsoft.com/office/word/2006/wordml" xmlns:sl="http://schemas.openxmlformats.org/schemaLibrary/2006/main" xmlns:a="http://schemas.openxmlformats.org/drawingml/2006/main" xmlns:pic="http://schemas.openxmlformats.org/drawingml/2006/picture" xmlns:c="http://schemas.openxmlformats.org/drawingml/2006/chart" xmlns:lc="http://schemas.openxmlformats.org/drawingml/2006/lockedCanvas" xmlns:dgm="http://schemas.openxmlformats.org/drawingml/2006/diagram" xmlns:wps="http://schemas.microsoft.com/office/word/2010/wordprocessingShape" xmlns:wpg="http://schemas.microsoft.com/office/word/2010/wordprocessingGroup" xmlns:w14="http://schemas.microsoft.com/office/word/2010/wordml" xmlns:w15="http://schemas.microsoft.com/office/word/2012/wordml" xmlns:w16="http://schemas.microsoft.com/office/word/2018/wordml" xmlns:w16cex="http://schemas.microsoft.com/office/word/2018/wordml/cex" xmlns:w16cid="http://schemas.microsoft.com/office/word/2016/wordml/cid" xmlns="http://schemas.microsoft.com/office/tasks/2019/documenttasks" xmlns:cr="http://schemas.microsoft.com/office/comments/2020/reactions">
+  <w:abstractNum xmlns:w="http://schemas.openxmlformats.org/wordprocessingml/2006/main" w:abstractNumId="13">
+    <w:nsid w:val="15dd2733"/>
+    <w:multiLevelType xmlns:w="http://schemas.openxmlformats.org/wordprocessingml/2006/main" w:val="hybridMultilevel"/>
+    <w:lvl xmlns:w="http://schemas.openxmlformats.org/wordprocessingml/2006/main" w:ilvl="0">
+      <w:start w:val="1"/>
+      <w:numFmt w:val="bullet"/>
+      <w:lvlText w:val=""/>
+      <w:lvlJc w:val="left"/>
+      <w:pPr>
+        <w:ind w:left="720" w:hanging="360"/>
+      </w:pPr>
+      <w:rPr>
+        <w:rFonts w:hint="default" w:ascii="Symbol" w:hAnsi="Symbol"/>
+      </w:rPr>
+    </w:lvl>
+    <w:lvl xmlns:w="http://schemas.openxmlformats.org/wordprocessingml/2006/main" w:ilvl="1">
+      <w:start w:val="1"/>
+      <w:numFmt w:val="bullet"/>
+      <w:lvlText w:val="o"/>
+      <w:lvlJc w:val="left"/>
+      <w:pPr>
+        <w:ind w:left="1440" w:hanging="360"/>
+      </w:pPr>
+      <w:rPr>
+        <w:rFonts w:hint="default" w:ascii="Courier New" w:hAnsi="Courier New"/>
+      </w:rPr>
+    </w:lvl>
+    <w:lvl xmlns:w="http://schemas.openxmlformats.org/wordprocessingml/2006/main" w:ilvl="2">
+      <w:start w:val="1"/>
+      <w:numFmt w:val="bullet"/>
+      <w:lvlText w:val=""/>
+      <w:lvlJc w:val="left"/>
+      <w:pPr>
+        <w:ind w:left="2160" w:hanging="360"/>
+      </w:pPr>
+      <w:rPr>
+        <w:rFonts w:hint="default" w:ascii="Wingdings" w:hAnsi="Wingdings"/>
+      </w:rPr>
+    </w:lvl>
+    <w:lvl xmlns:w="http://schemas.openxmlformats.org/wordprocessingml/2006/main" w:ilvl="3">
+      <w:start w:val="1"/>
+      <w:numFmt w:val="bullet"/>
+      <w:lvlText w:val=""/>
+      <w:lvlJc w:val="left"/>
+      <w:pPr>
+        <w:ind w:left="2880" w:hanging="360"/>
+      </w:pPr>
+      <w:rPr>
+        <w:rFonts w:hint="default" w:ascii="Symbol" w:hAnsi="Symbol"/>
+      </w:rPr>
+    </w:lvl>
+    <w:lvl xmlns:w="http://schemas.openxmlformats.org/wordprocessingml/2006/main" w:ilvl="4">
+      <w:start w:val="1"/>
+      <w:numFmt w:val="bullet"/>
+      <w:lvlText w:val="o"/>
+      <w:lvlJc w:val="left"/>
+      <w:pPr>
+        <w:ind w:left="3600" w:hanging="360"/>
+      </w:pPr>
+      <w:rPr>
+        <w:rFonts w:hint="default" w:ascii="Courier New" w:hAnsi="Courier New"/>
+      </w:rPr>
+    </w:lvl>
+    <w:lvl xmlns:w="http://schemas.openxmlformats.org/wordprocessingml/2006/main" w:ilvl="5">
+      <w:start w:val="1"/>
+      <w:numFmt w:val="bullet"/>
+      <w:lvlText w:val=""/>
+      <w:lvlJc w:val="left"/>
+      <w:pPr>
+        <w:ind w:left="4320" w:hanging="360"/>
+      </w:pPr>
+      <w:rPr>
+        <w:rFonts w:hint="default" w:ascii="Wingdings" w:hAnsi="Wingdings"/>
+      </w:rPr>
+    </w:lvl>
+    <w:lvl xmlns:w="http://schemas.openxmlformats.org/wordprocessingml/2006/main" w:ilvl="6">
+      <w:start w:val="1"/>
+      <w:numFmt w:val="bullet"/>
+      <w:lvlText w:val=""/>
+      <w:lvlJc w:val="left"/>
+      <w:pPr>
+        <w:ind w:left="5040" w:hanging="360"/>
+      </w:pPr>
+      <w:rPr>
+        <w:rFonts w:hint="default" w:ascii="Symbol" w:hAnsi="Symbol"/>
+      </w:rPr>
+    </w:lvl>
+    <w:lvl xmlns:w="http://schemas.openxmlformats.org/wordprocessingml/2006/main" w:ilvl="7">
+      <w:start w:val="1"/>
+      <w:numFmt w:val="bullet"/>
+      <w:lvlText w:val="o"/>
+      <w:lvlJc w:val="left"/>
+      <w:pPr>
+        <w:ind w:left="5760" w:hanging="360"/>
+      </w:pPr>
+      <w:rPr>
+        <w:rFonts w:hint="default" w:ascii="Courier New" w:hAnsi="Courier New"/>
+      </w:rPr>
+    </w:lvl>
+    <w:lvl xmlns:w="http://schemas.openxmlformats.org/wordprocessingml/2006/main" w:ilvl="8">
+      <w:start w:val="1"/>
+      <w:numFmt w:val="bullet"/>
+      <w:lvlText w:val=""/>
+      <w:lvlJc w:val="left"/>
+      <w:pPr>
+        <w:ind w:left="6480" w:hanging="360"/>
+      </w:pPr>
+      <w:rPr>
+        <w:rFonts w:hint="default" w:ascii="Wingdings" w:hAnsi="Wingdings"/>
+      </w:rPr>
+    </w:lvl>
+  </w:abstractNum>
+  <w:abstractNum xmlns:w="http://schemas.openxmlformats.org/wordprocessingml/2006/main" w:abstractNumId="12">
+    <w:nsid w:val="4b54d876"/>
+    <w:multiLevelType xmlns:w="http://schemas.openxmlformats.org/wordprocessingml/2006/main" w:val="hybridMultilevel"/>
+    <w:lvl xmlns:w="http://schemas.openxmlformats.org/wordprocessingml/2006/main" w:ilvl="0">
+      <w:start w:val="1"/>
+      <w:numFmt w:val="bullet"/>
+      <w:lvlText w:val=""/>
+      <w:lvlJc w:val="left"/>
+      <w:pPr>
+        <w:ind w:left="720" w:hanging="360"/>
+      </w:pPr>
+      <w:rPr>
+        <w:rFonts w:hint="default" w:ascii="Symbol" w:hAnsi="Symbol"/>
+      </w:rPr>
+    </w:lvl>
+    <w:lvl xmlns:w="http://schemas.openxmlformats.org/wordprocessingml/2006/main" w:ilvl="1">
+      <w:start w:val="1"/>
+      <w:numFmt w:val="bullet"/>
+      <w:lvlText w:val="o"/>
+      <w:lvlJc w:val="left"/>
+      <w:pPr>
+        <w:ind w:left="1440" w:hanging="360"/>
+      </w:pPr>
+      <w:rPr>
+        <w:rFonts w:hint="default" w:ascii="Courier New" w:hAnsi="Courier New"/>
+      </w:rPr>
+    </w:lvl>
+    <w:lvl xmlns:w="http://schemas.openxmlformats.org/wordprocessingml/2006/main" w:ilvl="2">
+      <w:start w:val="1"/>
+      <w:numFmt w:val="bullet"/>
+      <w:lvlText w:val=""/>
+      <w:lvlJc w:val="left"/>
+      <w:pPr>
+        <w:ind w:left="2160" w:hanging="360"/>
+      </w:pPr>
+      <w:rPr>
+        <w:rFonts w:hint="default" w:ascii="Wingdings" w:hAnsi="Wingdings"/>
+      </w:rPr>
+    </w:lvl>
+    <w:lvl xmlns:w="http://schemas.openxmlformats.org/wordprocessingml/2006/main" w:ilvl="3">
+      <w:start w:val="1"/>
+      <w:numFmt w:val="bullet"/>
+      <w:lvlText w:val=""/>
+      <w:lvlJc w:val="left"/>
+      <w:pPr>
+        <w:ind w:left="2880" w:hanging="360"/>
+      </w:pPr>
+      <w:rPr>
+        <w:rFonts w:hint="default" w:ascii="Symbol" w:hAnsi="Symbol"/>
+      </w:rPr>
+    </w:lvl>
+    <w:lvl xmlns:w="http://schemas.openxmlformats.org/wordprocessingml/2006/main" w:ilvl="4">
+      <w:start w:val="1"/>
+      <w:numFmt w:val="bullet"/>
+      <w:lvlText w:val="o"/>
+      <w:lvlJc w:val="left"/>
+      <w:pPr>
+        <w:ind w:left="3600" w:hanging="360"/>
+      </w:pPr>
+      <w:rPr>
+        <w:rFonts w:hint="default" w:ascii="Courier New" w:hAnsi="Courier New"/>
+      </w:rPr>
+    </w:lvl>
+    <w:lvl xmlns:w="http://schemas.openxmlformats.org/wordprocessingml/2006/main" w:ilvl="5">
+      <w:start w:val="1"/>
+      <w:numFmt w:val="bullet"/>
+      <w:lvlText w:val=""/>
+      <w:lvlJc w:val="left"/>
+      <w:pPr>
+        <w:ind w:left="4320" w:hanging="360"/>
+      </w:pPr>
+      <w:rPr>
+        <w:rFonts w:hint="default" w:ascii="Wingdings" w:hAnsi="Wingdings"/>
+      </w:rPr>
+    </w:lvl>
+    <w:lvl xmlns:w="http://schemas.openxmlformats.org/wordprocessingml/2006/main" w:ilvl="6">
+      <w:start w:val="1"/>
+      <w:numFmt w:val="bullet"/>
+      <w:lvlText w:val=""/>
+      <w:lvlJc w:val="left"/>
+      <w:pPr>
+        <w:ind w:left="5040" w:hanging="360"/>
+      </w:pPr>
+      <w:rPr>
+        <w:rFonts w:hint="default" w:ascii="Symbol" w:hAnsi="Symbol"/>
+      </w:rPr>
+    </w:lvl>
+    <w:lvl xmlns:w="http://schemas.openxmlformats.org/wordprocessingml/2006/main" w:ilvl="7">
+      <w:start w:val="1"/>
+      <w:numFmt w:val="bullet"/>
+      <w:lvlText w:val="o"/>
+      <w:lvlJc w:val="left"/>
+      <w:pPr>
+        <w:ind w:left="5760" w:hanging="360"/>
+      </w:pPr>
+      <w:rPr>
+        <w:rFonts w:hint="default" w:ascii="Courier New" w:hAnsi="Courier New"/>
+      </w:rPr>
+    </w:lvl>
+    <w:lvl xmlns:w="http://schemas.openxmlformats.org/wordprocessingml/2006/main" w:ilvl="8">
+      <w:start w:val="1"/>
+      <w:numFmt w:val="bullet"/>
+      <w:lvlText w:val=""/>
+      <w:lvlJc w:val="left"/>
+      <w:pPr>
+        <w:ind w:left="6480" w:hanging="360"/>
+      </w:pPr>
+      <w:rPr>
+        <w:rFonts w:hint="default" w:ascii="Wingdings" w:hAnsi="Wingdings"/>
+      </w:rPr>
+    </w:lvl>
+  </w:abstractNum>
+  <w:abstractNum xmlns:w="http://schemas.openxmlformats.org/wordprocessingml/2006/main" w:abstractNumId="11">
+    <w:nsid w:val="7565e406"/>
+    <w:multiLevelType xmlns:w="http://schemas.openxmlformats.org/wordprocessingml/2006/main" w:val="hybridMultilevel"/>
+    <w:lvl xmlns:w="http://schemas.openxmlformats.org/wordprocessingml/2006/main" w:ilvl="0">
+      <w:start w:val="1"/>
+      <w:numFmt w:val="bullet"/>
+      <w:lvlText w:val=""/>
+      <w:lvlJc w:val="left"/>
+      <w:pPr>
+        <w:ind w:left="720" w:hanging="360"/>
+      </w:pPr>
+      <w:rPr>
+        <w:rFonts w:hint="default" w:ascii="Symbol" w:hAnsi="Symbol"/>
+      </w:rPr>
+    </w:lvl>
+    <w:lvl xmlns:w="http://schemas.openxmlformats.org/wordprocessingml/2006/main" w:ilvl="1">
+      <w:start w:val="1"/>
+      <w:numFmt w:val="bullet"/>
+      <w:lvlText w:val="o"/>
+      <w:lvlJc w:val="left"/>
+      <w:pPr>
+        <w:ind w:left="1440" w:hanging="360"/>
+      </w:pPr>
+      <w:rPr>
+        <w:rFonts w:hint="default" w:ascii="Courier New" w:hAnsi="Courier New"/>
+      </w:rPr>
+    </w:lvl>
+    <w:lvl xmlns:w="http://schemas.openxmlformats.org/wordprocessingml/2006/main" w:ilvl="2">
+      <w:start w:val="1"/>
+      <w:numFmt w:val="bullet"/>
+      <w:lvlText w:val=""/>
+      <w:lvlJc w:val="left"/>
+      <w:pPr>
+        <w:ind w:left="2160" w:hanging="360"/>
+      </w:pPr>
+      <w:rPr>
+        <w:rFonts w:hint="default" w:ascii="Wingdings" w:hAnsi="Wingdings"/>
+      </w:rPr>
+    </w:lvl>
+    <w:lvl xmlns:w="http://schemas.openxmlformats.org/wordprocessingml/2006/main" w:ilvl="3">
+      <w:start w:val="1"/>
+      <w:numFmt w:val="bullet"/>
+      <w:lvlText w:val=""/>
+      <w:lvlJc w:val="left"/>
+      <w:pPr>
+        <w:ind w:left="2880" w:hanging="360"/>
+      </w:pPr>
+      <w:rPr>
+        <w:rFonts w:hint="default" w:ascii="Symbol" w:hAnsi="Symbol"/>
+      </w:rPr>
+    </w:lvl>
+    <w:lvl xmlns:w="http://schemas.openxmlformats.org/wordprocessingml/2006/main" w:ilvl="4">
+      <w:start w:val="1"/>
+      <w:numFmt w:val="bullet"/>
+      <w:lvlText w:val="o"/>
+      <w:lvlJc w:val="left"/>
+      <w:pPr>
+        <w:ind w:left="3600" w:hanging="360"/>
+      </w:pPr>
+      <w:rPr>
+        <w:rFonts w:hint="default" w:ascii="Courier New" w:hAnsi="Courier New"/>
+      </w:rPr>
+    </w:lvl>
+    <w:lvl xmlns:w="http://schemas.openxmlformats.org/wordprocessingml/2006/main" w:ilvl="5">
+      <w:start w:val="1"/>
+      <w:numFmt w:val="bullet"/>
+      <w:lvlText w:val=""/>
+      <w:lvlJc w:val="left"/>
+      <w:pPr>
+        <w:ind w:left="4320" w:hanging="360"/>
+      </w:pPr>
+      <w:rPr>
+        <w:rFonts w:hint="default" w:ascii="Wingdings" w:hAnsi="Wingdings"/>
+      </w:rPr>
+    </w:lvl>
+    <w:lvl xmlns:w="http://schemas.openxmlformats.org/wordprocessingml/2006/main" w:ilvl="6">
+      <w:start w:val="1"/>
+      <w:numFmt w:val="bullet"/>
+      <w:lvlText w:val=""/>
+      <w:lvlJc w:val="left"/>
+      <w:pPr>
+        <w:ind w:left="5040" w:hanging="360"/>
+      </w:pPr>
+      <w:rPr>
+        <w:rFonts w:hint="default" w:ascii="Symbol" w:hAnsi="Symbol"/>
+      </w:rPr>
+    </w:lvl>
+    <w:lvl xmlns:w="http://schemas.openxmlformats.org/wordprocessingml/2006/main" w:ilvl="7">
+      <w:start w:val="1"/>
+      <w:numFmt w:val="bullet"/>
+      <w:lvlText w:val="o"/>
+      <w:lvlJc w:val="left"/>
+      <w:pPr>
+        <w:ind w:left="5760" w:hanging="360"/>
+      </w:pPr>
+      <w:rPr>
+        <w:rFonts w:hint="default" w:ascii="Courier New" w:hAnsi="Courier New"/>
+      </w:rPr>
+    </w:lvl>
+    <w:lvl xmlns:w="http://schemas.openxmlformats.org/wordprocessingml/2006/main" w:ilvl="8">
+      <w:start w:val="1"/>
+      <w:numFmt w:val="bullet"/>
+      <w:lvlText w:val=""/>
+      <w:lvlJc w:val="left"/>
+      <w:pPr>
+        <w:ind w:left="6480" w:hanging="360"/>
+      </w:pPr>
+      <w:rPr>
+        <w:rFonts w:hint="default" w:ascii="Wingdings" w:hAnsi="Wingdings"/>
+      </w:rPr>
+    </w:lvl>
+  </w:abstractNum>
+  <w:abstractNum xmlns:w="http://schemas.openxmlformats.org/wordprocessingml/2006/main" w:abstractNumId="10">
+    <w:nsid w:val="4c07d206"/>
+    <w:multiLevelType xmlns:w="http://schemas.openxmlformats.org/wordprocessingml/2006/main" w:val="hybridMultilevel"/>
+    <w:lvl xmlns:w="http://schemas.openxmlformats.org/wordprocessingml/2006/main" w:ilvl="0">
+      <w:start w:val="1"/>
+      <w:numFmt w:val="bullet"/>
+      <w:lvlText w:val=""/>
+      <w:lvlJc w:val="left"/>
+      <w:pPr>
+        <w:ind w:left="720" w:hanging="360"/>
+      </w:pPr>
+      <w:rPr>
+        <w:rFonts w:hint="default" w:ascii="Symbol" w:hAnsi="Symbol"/>
+      </w:rPr>
+    </w:lvl>
+    <w:lvl xmlns:w="http://schemas.openxmlformats.org/wordprocessingml/2006/main" w:ilvl="1">
+      <w:start w:val="1"/>
+      <w:numFmt w:val="bullet"/>
+      <w:lvlText w:val="o"/>
+      <w:lvlJc w:val="left"/>
+      <w:pPr>
+        <w:ind w:left="1440" w:hanging="360"/>
+      </w:pPr>
+      <w:rPr>
+        <w:rFonts w:hint="default" w:ascii="Courier New" w:hAnsi="Courier New"/>
+      </w:rPr>
+    </w:lvl>
+    <w:lvl xmlns:w="http://schemas.openxmlformats.org/wordprocessingml/2006/main" w:ilvl="2">
+      <w:start w:val="1"/>
+      <w:numFmt w:val="bullet"/>
+      <w:lvlText w:val=""/>
+      <w:lvlJc w:val="left"/>
+      <w:pPr>
+        <w:ind w:left="2160" w:hanging="360"/>
+      </w:pPr>
+      <w:rPr>
+        <w:rFonts w:hint="default" w:ascii="Wingdings" w:hAnsi="Wingdings"/>
+      </w:rPr>
+    </w:lvl>
+    <w:lvl xmlns:w="http://schemas.openxmlformats.org/wordprocessingml/2006/main" w:ilvl="3">
+      <w:start w:val="1"/>
+      <w:numFmt w:val="bullet"/>
+      <w:lvlText w:val=""/>
+      <w:lvlJc w:val="left"/>
+      <w:pPr>
+        <w:ind w:left="2880" w:hanging="360"/>
+      </w:pPr>
+      <w:rPr>
+        <w:rFonts w:hint="default" w:ascii="Symbol" w:hAnsi="Symbol"/>
+      </w:rPr>
+    </w:lvl>
+    <w:lvl xmlns:w="http://schemas.openxmlformats.org/wordprocessingml/2006/main" w:ilvl="4">
+      <w:start w:val="1"/>
+      <w:numFmt w:val="bullet"/>
+      <w:lvlText w:val="o"/>
+      <w:lvlJc w:val="left"/>
+      <w:pPr>
+        <w:ind w:left="3600" w:hanging="360"/>
+      </w:pPr>
+      <w:rPr>
+        <w:rFonts w:hint="default" w:ascii="Courier New" w:hAnsi="Courier New"/>
+      </w:rPr>
+    </w:lvl>
+    <w:lvl xmlns:w="http://schemas.openxmlformats.org/wordprocessingml/2006/main" w:ilvl="5">
+      <w:start w:val="1"/>
+      <w:numFmt w:val="bullet"/>
+      <w:lvlText w:val=""/>
+      <w:lvlJc w:val="left"/>
+      <w:pPr>
+        <w:ind w:left="4320" w:hanging="360"/>
+      </w:pPr>
+      <w:rPr>
+        <w:rFonts w:hint="default" w:ascii="Wingdings" w:hAnsi="Wingdings"/>
+      </w:rPr>
+    </w:lvl>
+    <w:lvl xmlns:w="http://schemas.openxmlformats.org/wordprocessingml/2006/main" w:ilvl="6">
+      <w:start w:val="1"/>
+      <w:numFmt w:val="bullet"/>
+      <w:lvlText w:val=""/>
+      <w:lvlJc w:val="left"/>
+      <w:pPr>
+        <w:ind w:left="5040" w:hanging="360"/>
+      </w:pPr>
+      <w:rPr>
+        <w:rFonts w:hint="default" w:ascii="Symbol" w:hAnsi="Symbol"/>
+      </w:rPr>
+    </w:lvl>
+    <w:lvl xmlns:w="http://schemas.openxmlformats.org/wordprocessingml/2006/main" w:ilvl="7">
+      <w:start w:val="1"/>
+      <w:numFmt w:val="bullet"/>
+      <w:lvlText w:val="o"/>
+      <w:lvlJc w:val="left"/>
+      <w:pPr>
+        <w:ind w:left="5760" w:hanging="360"/>
+      </w:pPr>
+      <w:rPr>
+        <w:rFonts w:hint="default" w:ascii="Courier New" w:hAnsi="Courier New"/>
+      </w:rPr>
+    </w:lvl>
+    <w:lvl xmlns:w="http://schemas.openxmlformats.org/wordprocessingml/2006/main" w:ilvl="8">
+      <w:start w:val="1"/>
+      <w:numFmt w:val="bullet"/>
+      <w:lvlText w:val=""/>
+      <w:lvlJc w:val="left"/>
+      <w:pPr>
+        <w:ind w:left="6480" w:hanging="360"/>
+      </w:pPr>
+      <w:rPr>
+        <w:rFonts w:hint="default" w:ascii="Wingdings" w:hAnsi="Wingdings"/>
+      </w:rPr>
+    </w:lvl>
+  </w:abstractNum>
+  <w:abstractNum xmlns:w="http://schemas.openxmlformats.org/wordprocessingml/2006/main" w:abstractNumId="9">
+    <w:nsid w:val="23542435"/>
+    <w:multiLevelType xmlns:w="http://schemas.openxmlformats.org/wordprocessingml/2006/main" w:val="hybridMultilevel"/>
+    <w:lvl xmlns:w="http://schemas.openxmlformats.org/wordprocessingml/2006/main" w:ilvl="0">
+      <w:start w:val="1"/>
+      <w:numFmt w:val="bullet"/>
+      <w:lvlText w:val=""/>
+      <w:lvlJc w:val="left"/>
+      <w:pPr>
+        <w:ind w:left="720" w:hanging="360"/>
+      </w:pPr>
+      <w:rPr>
+        <w:rFonts w:hint="default" w:ascii="Symbol" w:hAnsi="Symbol"/>
+      </w:rPr>
+    </w:lvl>
+    <w:lvl xmlns:w="http://schemas.openxmlformats.org/wordprocessingml/2006/main" w:ilvl="1">
+      <w:start w:val="1"/>
+      <w:numFmt w:val="bullet"/>
+      <w:lvlText w:val="o"/>
+      <w:lvlJc w:val="left"/>
+      <w:pPr>
+        <w:ind w:left="1440" w:hanging="360"/>
+      </w:pPr>
+      <w:rPr>
+        <w:rFonts w:hint="default" w:ascii="Courier New" w:hAnsi="Courier New"/>
+      </w:rPr>
+    </w:lvl>
+    <w:lvl xmlns:w="http://schemas.openxmlformats.org/wordprocessingml/2006/main" w:ilvl="2">
+      <w:start w:val="1"/>
+      <w:numFmt w:val="bullet"/>
+      <w:lvlText w:val=""/>
+      <w:lvlJc w:val="left"/>
+      <w:pPr>
+        <w:ind w:left="2160" w:hanging="360"/>
+      </w:pPr>
+      <w:rPr>
+        <w:rFonts w:hint="default" w:ascii="Wingdings" w:hAnsi="Wingdings"/>
+      </w:rPr>
+    </w:lvl>
+    <w:lvl xmlns:w="http://schemas.openxmlformats.org/wordprocessingml/2006/main" w:ilvl="3">
+      <w:start w:val="1"/>
+      <w:numFmt w:val="bullet"/>
+      <w:lvlText w:val=""/>
+      <w:lvlJc w:val="left"/>
+      <w:pPr>
+        <w:ind w:left="2880" w:hanging="360"/>
+      </w:pPr>
+      <w:rPr>
+        <w:rFonts w:hint="default" w:ascii="Symbol" w:hAnsi="Symbol"/>
+      </w:rPr>
+    </w:lvl>
+    <w:lvl xmlns:w="http://schemas.openxmlformats.org/wordprocessingml/2006/main" w:ilvl="4">
+      <w:start w:val="1"/>
+      <w:numFmt w:val="bullet"/>
+      <w:lvlText w:val="o"/>
+      <w:lvlJc w:val="left"/>
+      <w:pPr>
+        <w:ind w:left="3600" w:hanging="360"/>
+      </w:pPr>
+      <w:rPr>
+        <w:rFonts w:hint="default" w:ascii="Courier New" w:hAnsi="Courier New"/>
+      </w:rPr>
+    </w:lvl>
+    <w:lvl xmlns:w="http://schemas.openxmlformats.org/wordprocessingml/2006/main" w:ilvl="5">
+      <w:start w:val="1"/>
+      <w:numFmt w:val="bullet"/>
+      <w:lvlText w:val=""/>
+      <w:lvlJc w:val="left"/>
+      <w:pPr>
+        <w:ind w:left="4320" w:hanging="360"/>
+      </w:pPr>
+      <w:rPr>
+        <w:rFonts w:hint="default" w:ascii="Wingdings" w:hAnsi="Wingdings"/>
+      </w:rPr>
+    </w:lvl>
+    <w:lvl xmlns:w="http://schemas.openxmlformats.org/wordprocessingml/2006/main" w:ilvl="6">
+      <w:start w:val="1"/>
+      <w:numFmt w:val="bullet"/>
+      <w:lvlText w:val=""/>
+      <w:lvlJc w:val="left"/>
+      <w:pPr>
+        <w:ind w:left="5040" w:hanging="360"/>
+      </w:pPr>
+      <w:rPr>
+        <w:rFonts w:hint="default" w:ascii="Symbol" w:hAnsi="Symbol"/>
+      </w:rPr>
+    </w:lvl>
+    <w:lvl xmlns:w="http://schemas.openxmlformats.org/wordprocessingml/2006/main" w:ilvl="7">
+      <w:start w:val="1"/>
+      <w:numFmt w:val="bullet"/>
+      <w:lvlText w:val="o"/>
+      <w:lvlJc w:val="left"/>
+      <w:pPr>
+        <w:ind w:left="5760" w:hanging="360"/>
+      </w:pPr>
+      <w:rPr>
+        <w:rFonts w:hint="default" w:ascii="Courier New" w:hAnsi="Courier New"/>
+      </w:rPr>
+    </w:lvl>
+    <w:lvl xmlns:w="http://schemas.openxmlformats.org/wordprocessingml/2006/main" w:ilvl="8">
+      <w:start w:val="1"/>
+      <w:numFmt w:val="bullet"/>
+      <w:lvlText w:val=""/>
+      <w:lvlJc w:val="left"/>
+      <w:pPr>
+        <w:ind w:left="6480" w:hanging="360"/>
+      </w:pPr>
+      <w:rPr>
+        <w:rFonts w:hint="default" w:ascii="Wingdings" w:hAnsi="Wingdings"/>
+      </w:rPr>
+    </w:lvl>
+  </w:abstractNum>
+  <w:abstractNum xmlns:w="http://schemas.openxmlformats.org/wordprocessingml/2006/main" w:abstractNumId="8">
+    <w:nsid w:val="2792cc5c"/>
+    <w:multiLevelType xmlns:w="http://schemas.openxmlformats.org/wordprocessingml/2006/main" w:val="hybridMultilevel"/>
+    <w:lvl xmlns:w="http://schemas.openxmlformats.org/wordprocessingml/2006/main" w:ilvl="0">
+      <w:start w:val="1"/>
+      <w:numFmt w:val="bullet"/>
+      <w:lvlText w:val=""/>
+      <w:lvlJc w:val="left"/>
+      <w:pPr>
+        <w:ind w:left="720" w:hanging="360"/>
+      </w:pPr>
+      <w:rPr>
+        <w:rFonts w:hint="default" w:ascii="Symbol" w:hAnsi="Symbol"/>
+      </w:rPr>
+    </w:lvl>
+    <w:lvl xmlns:w="http://schemas.openxmlformats.org/wordprocessingml/2006/main" w:ilvl="1">
+      <w:start w:val="1"/>
+      <w:numFmt w:val="bullet"/>
+      <w:lvlText w:val="o"/>
+      <w:lvlJc w:val="left"/>
+      <w:pPr>
+        <w:ind w:left="1440" w:hanging="360"/>
+      </w:pPr>
+      <w:rPr>
+        <w:rFonts w:hint="default" w:ascii="Courier New" w:hAnsi="Courier New"/>
+      </w:rPr>
+    </w:lvl>
+    <w:lvl xmlns:w="http://schemas.openxmlformats.org/wordprocessingml/2006/main" w:ilvl="2">
+      <w:start w:val="1"/>
+      <w:numFmt w:val="bullet"/>
+      <w:lvlText w:val=""/>
+      <w:lvlJc w:val="left"/>
+      <w:pPr>
+        <w:ind w:left="2160" w:hanging="360"/>
+      </w:pPr>
+      <w:rPr>
+        <w:rFonts w:hint="default" w:ascii="Wingdings" w:hAnsi="Wingdings"/>
+      </w:rPr>
+    </w:lvl>
+    <w:lvl xmlns:w="http://schemas.openxmlformats.org/wordprocessingml/2006/main" w:ilvl="3">
+      <w:start w:val="1"/>
+      <w:numFmt w:val="bullet"/>
+      <w:lvlText w:val=""/>
+      <w:lvlJc w:val="left"/>
+      <w:pPr>
+        <w:ind w:left="2880" w:hanging="360"/>
+      </w:pPr>
+      <w:rPr>
+        <w:rFonts w:hint="default" w:ascii="Symbol" w:hAnsi="Symbol"/>
+      </w:rPr>
+    </w:lvl>
+    <w:lvl xmlns:w="http://schemas.openxmlformats.org/wordprocessingml/2006/main" w:ilvl="4">
+      <w:start w:val="1"/>
+      <w:numFmt w:val="bullet"/>
+      <w:lvlText w:val="o"/>
+      <w:lvlJc w:val="left"/>
+      <w:pPr>
+        <w:ind w:left="3600" w:hanging="360"/>
+      </w:pPr>
+      <w:rPr>
+        <w:rFonts w:hint="default" w:ascii="Courier New" w:hAnsi="Courier New"/>
+      </w:rPr>
+    </w:lvl>
+    <w:lvl xmlns:w="http://schemas.openxmlformats.org/wordprocessingml/2006/main" w:ilvl="5">
+      <w:start w:val="1"/>
+      <w:numFmt w:val="bullet"/>
+      <w:lvlText w:val=""/>
+      <w:lvlJc w:val="left"/>
+      <w:pPr>
+        <w:ind w:left="4320" w:hanging="360"/>
+      </w:pPr>
+      <w:rPr>
+        <w:rFonts w:hint="default" w:ascii="Wingdings" w:hAnsi="Wingdings"/>
+      </w:rPr>
+    </w:lvl>
+    <w:lvl xmlns:w="http://schemas.openxmlformats.org/wordprocessingml/2006/main" w:ilvl="6">
+      <w:start w:val="1"/>
+      <w:numFmt w:val="bullet"/>
+      <w:lvlText w:val=""/>
+      <w:lvlJc w:val="left"/>
+      <w:pPr>
+        <w:ind w:left="5040" w:hanging="360"/>
+      </w:pPr>
+      <w:rPr>
+        <w:rFonts w:hint="default" w:ascii="Symbol" w:hAnsi="Symbol"/>
+      </w:rPr>
+    </w:lvl>
+    <w:lvl xmlns:w="http://schemas.openxmlformats.org/wordprocessingml/2006/main" w:ilvl="7">
+      <w:start w:val="1"/>
+      <w:numFmt w:val="bullet"/>
+      <w:lvlText w:val="o"/>
+      <w:lvlJc w:val="left"/>
+      <w:pPr>
+        <w:ind w:left="5760" w:hanging="360"/>
+      </w:pPr>
+      <w:rPr>
+        <w:rFonts w:hint="default" w:ascii="Courier New" w:hAnsi="Courier New"/>
+      </w:rPr>
+    </w:lvl>
+    <w:lvl xmlns:w="http://schemas.openxmlformats.org/wordprocessingml/2006/main" w:ilvl="8">
+      <w:start w:val="1"/>
+      <w:numFmt w:val="bullet"/>
+      <w:lvlText w:val=""/>
+      <w:lvlJc w:val="left"/>
+      <w:pPr>
+        <w:ind w:left="6480" w:hanging="360"/>
+      </w:pPr>
+      <w:rPr>
+        <w:rFonts w:hint="default" w:ascii="Wingdings" w:hAnsi="Wingdings"/>
+      </w:rPr>
+    </w:lvl>
+  </w:abstractNum>
   <w:abstractNum w:abstractNumId="1">
     <w:lvl w:ilvl="0">
       <w:start w:val="1"/>
@@ -3399,6 +5772,24 @@
     </w:lvl>
     <w:nsid w:val="74429877"/>
   </w:abstractNum>
+  <w:num w:numId="13">
+    <w:abstractNumId w:val="13"/>
+  </w:num>
+  <w:num w:numId="12">
+    <w:abstractNumId w:val="12"/>
+  </w:num>
+  <w:num w:numId="11">
+    <w:abstractNumId w:val="11"/>
+  </w:num>
+  <w:num w:numId="10">
+    <w:abstractNumId w:val="10"/>
+  </w:num>
+  <w:num w:numId="9">
+    <w:abstractNumId w:val="9"/>
+  </w:num>
+  <w:num w:numId="8">
+    <w:abstractNumId w:val="8"/>
+  </w:num>
   <w:num w:numId="1">
     <w:abstractNumId w:val="1"/>
   </w:num>
@@ -3613,6 +6004,148 @@
         <w:right w:w="108" w:type="dxa"/>
       </w:tblCellMar>
     </w:tblPr>
+  </w:style>
+  <w:style xmlns:w14="http://schemas.microsoft.com/office/word/2010/wordml" xmlns:mc="http://schemas.openxmlformats.org/markup-compatibility/2006" xmlns:w="http://schemas.openxmlformats.org/wordprocessingml/2006/main" w:type="table" w:styleId="GridTable5Dark-Accent1" mc:Ignorable="w14">
+    <w:name xmlns:w="http://schemas.openxmlformats.org/wordprocessingml/2006/main" w:val="Grid Table 5 Dark Accent 1"/>
+    <w:basedOn xmlns:w="http://schemas.openxmlformats.org/wordprocessingml/2006/main" w:val="TableNormal"/>
+    <w:uiPriority xmlns:w="http://schemas.openxmlformats.org/wordprocessingml/2006/main" w:val="50"/>
+    <w:pPr xmlns:w="http://schemas.openxmlformats.org/wordprocessingml/2006/main">
+      <w:spacing xmlns:w="http://schemas.openxmlformats.org/wordprocessingml/2006/main" w:after="0" w:line="240" w:lineRule="auto"/>
+    </w:pPr>
+    <w:tblPr xmlns:w="http://schemas.openxmlformats.org/wordprocessingml/2006/main">
+      <w:tblStyleRowBandSize w:val="1"/>
+      <w:tblStyleColBandSize w:val="1"/>
+      <w:tblInd w:w="0" w:type="dxa"/>
+      <w:tblBorders>
+        <w:top w:val="single" w:color="FFFFFF" w:themeColor="background1" w:sz="4" w:space="0"/>
+        <w:left w:val="single" w:color="FFFFFF" w:themeColor="background1" w:sz="4" w:space="0"/>
+        <w:bottom w:val="single" w:color="FFFFFF" w:themeColor="background1" w:sz="4" w:space="0"/>
+        <w:right w:val="single" w:color="FFFFFF" w:themeColor="background1" w:sz="4" w:space="0"/>
+        <w:insideH w:val="single" w:color="FFFFFF" w:themeColor="background1" w:sz="4" w:space="0"/>
+        <w:insideV w:val="single" w:color="FFFFFF" w:themeColor="background1" w:sz="4" w:space="0"/>
+      </w:tblBorders>
+      <w:tblCellMar>
+        <w:top w:w="0" w:type="dxa"/>
+        <w:left w:w="108" w:type="dxa"/>
+        <w:bottom w:w="0" w:type="dxa"/>
+        <w:right w:w="108" w:type="dxa"/>
+      </w:tblCellMar>
+    </w:tblPr>
+    <w:tcPr xmlns:w="http://schemas.openxmlformats.org/wordprocessingml/2006/main">
+      <w:shd w:val="clear" w:color="auto" w:fill="DEEAF6" w:themeFill="accent1" w:themeFillTint="33"/>
+    </w:tcPr>
+    <w:tblStylePr xmlns:w="http://schemas.openxmlformats.org/wordprocessingml/2006/main" w:type="firstRow">
+      <w:rPr>
+        <w:b/>
+        <w:bCs/>
+        <w:color w:val="FFFFFF" w:themeColor="background1"/>
+      </w:rPr>
+      <w:tblPr/>
+      <w:tcPr>
+        <w:tcBorders>
+          <w:top w:val="single" w:color="FFFFFF" w:themeColor="background1" w:sz="4" w:space="0"/>
+          <w:left w:val="single" w:color="FFFFFF" w:themeColor="background1" w:sz="4" w:space="0"/>
+          <w:right w:val="single" w:color="FFFFFF" w:themeColor="background1" w:sz="4" w:space="0"/>
+          <w:insideH w:val="nil"/>
+          <w:insideV w:val="nil"/>
+        </w:tcBorders>
+        <w:shd w:val="clear" w:color="auto" w:fill="5B9BD5" w:themeFill="accent1"/>
+      </w:tcPr>
+    </w:tblStylePr>
+    <w:tblStylePr xmlns:w="http://schemas.openxmlformats.org/wordprocessingml/2006/main" w:type="lastRow">
+      <w:rPr>
+        <w:b/>
+        <w:bCs/>
+        <w:color w:val="FFFFFF" w:themeColor="background1"/>
+      </w:rPr>
+      <w:tblPr/>
+      <w:tcPr>
+        <w:tcBorders>
+          <w:left w:val="single" w:color="FFFFFF" w:themeColor="background1" w:sz="4" w:space="0"/>
+          <w:bottom w:val="single" w:color="FFFFFF" w:themeColor="background1" w:sz="4" w:space="0"/>
+          <w:right w:val="single" w:color="FFFFFF" w:themeColor="background1" w:sz="4" w:space="0"/>
+          <w:insideH w:val="nil"/>
+          <w:insideV w:val="nil"/>
+        </w:tcBorders>
+        <w:shd w:val="clear" w:color="auto" w:fill="5B9BD5" w:themeFill="accent1"/>
+      </w:tcPr>
+    </w:tblStylePr>
+    <w:tblStylePr xmlns:w="http://schemas.openxmlformats.org/wordprocessingml/2006/main" w:type="firstCol">
+      <w:rPr>
+        <w:b/>
+        <w:bCs/>
+        <w:color w:val="FFFFFF" w:themeColor="background1"/>
+      </w:rPr>
+      <w:tblPr/>
+      <w:tcPr>
+        <w:tcBorders>
+          <w:top w:val="single" w:color="FFFFFF" w:themeColor="background1" w:sz="4" w:space="0"/>
+          <w:left w:val="single" w:color="FFFFFF" w:themeColor="background1" w:sz="4" w:space="0"/>
+          <w:bottom w:val="single" w:color="FFFFFF" w:themeColor="background1" w:sz="4" w:space="0"/>
+          <w:insideV w:val="nil"/>
+        </w:tcBorders>
+        <w:shd w:val="clear" w:color="auto" w:fill="5B9BD5" w:themeFill="accent1"/>
+      </w:tcPr>
+    </w:tblStylePr>
+    <w:tblStylePr xmlns:w="http://schemas.openxmlformats.org/wordprocessingml/2006/main" w:type="lastCol">
+      <w:rPr>
+        <w:b/>
+        <w:bCs/>
+        <w:color w:val="FFFFFF" w:themeColor="background1"/>
+      </w:rPr>
+      <w:tblPr/>
+      <w:tcPr>
+        <w:tcBorders>
+          <w:top w:val="single" w:color="FFFFFF" w:themeColor="background1" w:sz="4" w:space="0"/>
+          <w:bottom w:val="single" w:color="FFFFFF" w:themeColor="background1" w:sz="4" w:space="0"/>
+          <w:right w:val="single" w:color="FFFFFF" w:themeColor="background1" w:sz="4" w:space="0"/>
+          <w:insideV w:val="nil"/>
+        </w:tcBorders>
+        <w:shd w:val="clear" w:color="auto" w:fill="5B9BD5" w:themeFill="accent1"/>
+      </w:tcPr>
+    </w:tblStylePr>
+    <w:tblStylePr xmlns:w="http://schemas.openxmlformats.org/wordprocessingml/2006/main" w:type="band1Vert">
+      <w:tblPr/>
+      <w:tcPr>
+        <w:shd w:val="clear" w:color="auto" w:fill="BDD6EE" w:themeFill="accent1" w:themeFillTint="66"/>
+      </w:tcPr>
+    </w:tblStylePr>
+    <w:tblStylePr xmlns:w="http://schemas.openxmlformats.org/wordprocessingml/2006/main" w:type="band1Horz">
+      <w:tblPr/>
+      <w:tcPr>
+        <w:shd w:val="clear" w:color="auto" w:fill="BDD6EE" w:themeFill="accent1" w:themeFillTint="66"/>
+      </w:tcPr>
+    </w:tblStylePr>
+  </w:style>
+  <w:style w:type="character" w:styleId="DefaultParagraphFont" w:default="1">
+    <w:uiPriority w:val="1"/>
+    <w:name w:val="Default Paragraph Font"/>
+    <w:semiHidden/>
+    <w:unhideWhenUsed/>
+    <w:rsid w:val="551C4522"/>
+  </w:style>
+  <w:style w:type="character" w:styleId="Hyperlink">
+    <w:uiPriority w:val="99"/>
+    <w:name w:val="Hyperlink"/>
+    <w:basedOn w:val="DefaultParagraphFont"/>
+    <w:unhideWhenUsed/>
+    <w:rsid w:val="551C4522"/>
+    <w:rPr>
+      <w:color w:val="0000FF"/>
+      <w:u w:val="single"/>
+    </w:rPr>
+  </w:style>
+  <w:style w:type="paragraph" w:styleId="ListParagraph">
+    <w:uiPriority w:val="34"/>
+    <w:name w:val="List Paragraph"/>
+    <w:basedOn w:val="Normal"/>
+    <w:qFormat/>
+    <w:rsid w:val="551C4522"/>
+    <w:pPr>
+      <w:spacing/>
+      <w:ind w:left="720"/>
+      <w:contextualSpacing/>
+    </w:pPr>
   </w:style>
 </w:styles>
 </file>

</xml_diff>

<commit_message>
Subindo Documentação Finalizada e Revisada
</commit_message>
<xml_diff>
--- a/Documentação_Rocket_League.docx
+++ b/Documentação_Rocket_League.docx
@@ -2,26 +2,20 @@
 <file path=word/document.xml><?xml version="1.0" encoding="utf-8"?>
 <w:document xmlns:wp14="http://schemas.microsoft.com/office/word/2010/wordprocessingDrawing" xmlns:mc="http://schemas.openxmlformats.org/markup-compatibility/2006" xmlns:o="urn:schemas-microsoft-com:office:office" xmlns:r="http://schemas.openxmlformats.org/officeDocument/2006/relationships" xmlns:m="http://schemas.openxmlformats.org/officeDocument/2006/math" xmlns:v="urn:schemas-microsoft-com:vml" xmlns:wp="http://schemas.openxmlformats.org/drawingml/2006/wordprocessingDrawing" xmlns:w10="urn:schemas-microsoft-com:office:word" xmlns:w="http://schemas.openxmlformats.org/wordprocessingml/2006/main" xmlns:wne="http://schemas.microsoft.com/office/word/2006/wordml" xmlns:sl="http://schemas.openxmlformats.org/schemaLibrary/2006/main" xmlns:a="http://schemas.openxmlformats.org/drawingml/2006/main" xmlns:pic="http://schemas.openxmlformats.org/drawingml/2006/picture" xmlns:c="http://schemas.openxmlformats.org/drawingml/2006/chart" xmlns:lc="http://schemas.openxmlformats.org/drawingml/2006/lockedCanvas" xmlns:dgm="http://schemas.openxmlformats.org/drawingml/2006/diagram" xmlns:wps="http://schemas.microsoft.com/office/word/2010/wordprocessingShape" xmlns:wpg="http://schemas.microsoft.com/office/word/2010/wordprocessingGroup" xmlns:w14="http://schemas.microsoft.com/office/word/2010/wordml" xmlns:w15="http://schemas.microsoft.com/office/word/2012/wordml" xmlns:w16="http://schemas.microsoft.com/office/word/2018/wordml" xmlns:w16cex="http://schemas.microsoft.com/office/word/2018/wordml/cex" xmlns:w16cid="http://schemas.microsoft.com/office/word/2016/wordml/cid" xmlns="http://schemas.microsoft.com/office/tasks/2019/documenttasks" xmlns:cr="http://schemas.microsoft.com/office/comments/2020/reactions" xmlns:a14="http://schemas.microsoft.com/office/drawing/2010/main" mc:Ignorable="wp14">
   <w:body>
-    <w:p xmlns:wp14="http://schemas.microsoft.com/office/word/2010/wordml" wp14:textId="3A53E740">
-      <w:pPr>
-        <w:pStyle w:val="Title"/>
-        <w:ind w:hanging="992"/>
+    <w:p xmlns:wp14="http://schemas.microsoft.com/office/word/2010/wordml" wp14:textId="7B5637BC">
+      <w:pPr>
+        <w:pStyle w:val="Normal"/>
+        <w:ind/>
       </w:pPr>
       <w:r>
         <w:drawing>
-          <wp:anchor xmlns:wp14="http://schemas.microsoft.com/office/word/2010/wordprocessingDrawing" distT="0" distB="0" distL="114300" distR="114300" simplePos="0" relativeHeight="251658240" behindDoc="0" locked="0" layoutInCell="1" allowOverlap="1" wp14:editId="7FDF0626" wp14:anchorId="5DBB3658">
-            <wp:simplePos x="0" y="0"/>
-            <wp:positionH relativeFrom="column">
-              <wp:align>left</wp:align>
-            </wp:positionH>
-            <wp:positionV relativeFrom="paragraph">
-              <wp:posOffset>0</wp:posOffset>
-            </wp:positionV>
+          <wp:inline xmlns:wp14="http://schemas.microsoft.com/office/word/2010/wordprocessingDrawing" wp14:editId="2CFCF73E" wp14:anchorId="3A7648C8">
             <wp:extent cx="1176338" cy="659745"/>
             <wp:effectExtent l="0" t="0" r="0" b="0"/>
-            <wp:wrapSquare wrapText="bothSides"/>
-            <wp:docPr id="1" name="image1.png"/>
-            <wp:cNvGraphicFramePr/>
+            <wp:docPr id="1325429046" name="image1.png"/>
+            <wp:cNvGraphicFramePr>
+              <a:graphicFrameLocks/>
+            </wp:cNvGraphicFramePr>
             <a:graphic>
               <a:graphicData xmlns:a="http://schemas.openxmlformats.org/drawingml/2006/main" uri="http://schemas.openxmlformats.org/drawingml/2006/picture">
                 <pic:pic xmlns:pic="http://schemas.openxmlformats.org/drawingml/2006/picture">
@@ -31,50 +25,6 @@
                   </pic:nvPicPr>
                   <pic:blipFill>
                     <a:blip xmlns:r="http://schemas.openxmlformats.org/officeDocument/2006/relationships" r:embed="rId6"/>
-                    <a:srcRect l="0" t="0" r="0" b="0"/>
-                    <a:stretch>
-                      <a:fillRect/>
-                    </a:stretch>
-                  </pic:blipFill>
-                  <pic:spPr>
-                    <a:xfrm>
-                      <a:off x="0" y="0"/>
-                      <a:ext cx="1176338" cy="659745"/>
-                    </a:xfrm>
-                    <a:prstGeom prst="rect"/>
-                    <a:ln/>
-                  </pic:spPr>
-                </pic:pic>
-              </a:graphicData>
-            </a:graphic>
-            <wp14:sizeRelH relativeFrom="page">
-              <wp14:pctWidth>0</wp14:pctWidth>
-            </wp14:sizeRelH>
-            <wp14:sizeRelV relativeFrom="page">
-              <wp14:pctHeight>0</wp14:pctHeight>
-            </wp14:sizeRelV>
-          </wp:anchor>
-        </w:drawing>
-      </w:r>
-      <w:r>
-        <w:rPr>
-          <w:sz w:val="64"/>
-          <w:szCs w:val="64"/>
-        </w:rPr>
-        <w:drawing>
-          <wp:inline xmlns:wp14="http://schemas.microsoft.com/office/word/2010/wordprocessingDrawing" distT="114300" distB="114300" distL="114300" distR="114300" wp14:anchorId="3A8E9F72" wp14:editId="7777777">
-            <wp:extent cx="1176338" cy="659745"/>
-            <wp:effectExtent l="0" t="0" r="0" b="0"/>
-            <wp:docPr id="154369186" name="image1.png"/>
-            <a:graphic>
-              <a:graphicData uri="http://schemas.openxmlformats.org/drawingml/2006/picture">
-                <pic:pic>
-                  <pic:nvPicPr>
-                    <pic:cNvPr id="0" name="image1.png"/>
-                    <pic:cNvPicPr preferRelativeResize="0"/>
-                  </pic:nvPicPr>
-                  <pic:blipFill>
-                    <a:blip r:embed="rId6"/>
                     <a:srcRect l="0" t="0" r="0" b="0"/>
                     <a:stretch>
                       <a:fillRect/>
@@ -2346,24 +2296,19 @@
         <w:t xml:space="preserve"> Técnica</w:t>
       </w:r>
     </w:p>
-    <w:p xmlns:wp14="http://schemas.microsoft.com/office/word/2010/wordml" wp14:textId="5E4D6126">
+    <w:p xmlns:wp14="http://schemas.microsoft.com/office/word/2010/wordml" wp14:textId="0A3A77AA">
       <w:pPr>
         <w:pStyle w:val="Normal"/>
         <w:suppressLineNumbers w:val="0"/>
-        <w:bidi w:val="0"/>
         <w:spacing w:before="0" w:beforeAutospacing="off" w:after="0" w:afterAutospacing="off" w:line="276" w:lineRule="auto"/>
-        <w:ind w:left="0" w:right="0"/>
-        <w:jc w:val="center"/>
-        <w:rPr>
-          <w:u w:val="single"/>
-        </w:rPr>
+        <w:ind/>
       </w:pPr>
       <w:r>
         <w:drawing>
-          <wp:inline xmlns:wp14="http://schemas.microsoft.com/office/word/2010/wordprocessingDrawing" wp14:editId="7F24F2AA" wp14:anchorId="3770762E">
-            <wp:extent cx="5724525" cy="3476625"/>
+          <wp:inline xmlns:wp14="http://schemas.microsoft.com/office/word/2010/wordprocessingDrawing" wp14:editId="623C11BE" wp14:anchorId="239666DC">
+            <wp:extent cx="5724525" cy="2733675"/>
             <wp:effectExtent l="0" t="0" r="0" b="0"/>
-            <wp:docPr id="504590116" name="drawing"/>
+            <wp:docPr id="776950046" name="drawing"/>
             <wp:cNvGraphicFramePr>
               <a:graphicFrameLocks noChangeAspect="1"/>
             </wp:cNvGraphicFramePr>
@@ -2371,11 +2316,11 @@
               <a:graphicData xmlns:a="http://schemas.openxmlformats.org/drawingml/2006/main" uri="http://schemas.openxmlformats.org/drawingml/2006/picture">
                 <pic:pic xmlns:pic="http://schemas.openxmlformats.org/drawingml/2006/picture">
                   <pic:nvPicPr>
-                    <pic:cNvPr id="504590116" name="Picture 504590116"/>
+                    <pic:cNvPr id="776950046" name="Picture 776950046"/>
                     <pic:cNvPicPr/>
                   </pic:nvPicPr>
                   <pic:blipFill>
-                    <a:blip xmlns:r="http://schemas.openxmlformats.org/officeDocument/2006/relationships" r:embed="rId435888784">
+                    <a:blip xmlns:r="http://schemas.openxmlformats.org/officeDocument/2006/relationships" r:embed="rId303757273">
                       <a:extLst>
                         <a:ext uri="{28A0092B-C50C-407E-A947-70E740481C1C}">
                           <a14:useLocalDpi xmlns:a14="http://schemas.microsoft.com/office/drawing/2010/main"/>
@@ -2389,7 +2334,7 @@
                   <pic:spPr>
                     <a:xfrm>
                       <a:off x="0" y="0"/>
-                      <a:ext cx="5724525" cy="3476625"/>
+                      <a:ext cx="5724525" cy="2733675"/>
                     </a:xfrm>
                     <a:prstGeom prst="rect">
                       <a:avLst/>
@@ -3836,7 +3781,6 @@
     <w:p xmlns:wp14="http://schemas.microsoft.com/office/word/2010/wordml" wp14:textId="77777777">
       <w:pPr>
         <w:pStyle w:val="Heading1"/>
-        <w:ind w:left="0"/>
       </w:pPr>
       <w:r>
         <w:rPr>
@@ -4009,7 +3953,17 @@
                 <w:szCs w:val="22"/>
                 <w:lang w:val="pt-BR"/>
               </w:rPr>
-              <w:t>Responsável pela estilização visual da aplicação, incluindo layout responsivo, efeitos visuais, animações, sistema glassmorphism, organização dos gráficos e identidade visual inspirada no Rocket League.</w:t>
+              <w:t>Responsável pela estilização visual da aplicação, incluindo efeitos visuais, animações</w:t>
+            </w:r>
+            <w:r>
+              <w:rPr>
+                <w:rFonts w:ascii="Arial" w:hAnsi="Arial" w:eastAsia="Arial" w:cs="Arial"/>
+                <w:noProof w:val="0"/>
+                <w:sz w:val="22"/>
+                <w:szCs w:val="22"/>
+                <w:lang w:val="pt-BR"/>
+              </w:rPr>
+              <w:t>, organização dos gráficos e identidade visual inspirada no Rocket League.</w:t>
             </w:r>
           </w:p>
         </w:tc>
@@ -4172,6 +4126,13 @@
             <w:pPr>
               <w:pStyle w:val="Normal"/>
               <w:jc w:val="center"/>
+              <w:rPr>
+                <w:rFonts w:ascii="Arial" w:hAnsi="Arial" w:eastAsia="Arial" w:cs="Arial"/>
+                <w:noProof w:val="0"/>
+                <w:sz w:val="22"/>
+                <w:szCs w:val="22"/>
+                <w:lang w:val="en-US"/>
+              </w:rPr>
             </w:pPr>
             <w:r>
               <w:rPr>
@@ -4181,7 +4142,57 @@
                 <w:szCs w:val="22"/>
                 <w:lang w:val="en-US"/>
               </w:rPr>
-              <w:t>Utilizado para executar máquinas virtuais durante o desenvolvimento do projeto, permitindo configurar ambientes isolados para testes e execução do sistema.</w:t>
+              <w:t xml:space="preserve">Utilizado para executar </w:t>
+            </w:r>
+            <w:r>
+              <w:rPr>
+                <w:rFonts w:ascii="Arial" w:hAnsi="Arial" w:eastAsia="Arial" w:cs="Arial"/>
+                <w:noProof w:val="0"/>
+                <w:sz w:val="22"/>
+                <w:szCs w:val="22"/>
+                <w:lang w:val="en-US"/>
+              </w:rPr>
+              <w:t xml:space="preserve">a </w:t>
+            </w:r>
+            <w:r>
+              <w:rPr>
+                <w:rFonts w:ascii="Arial" w:hAnsi="Arial" w:eastAsia="Arial" w:cs="Arial"/>
+                <w:noProof w:val="0"/>
+                <w:sz w:val="22"/>
+                <w:szCs w:val="22"/>
+                <w:lang w:val="en-US"/>
+              </w:rPr>
+              <w:t>máquina virtua</w:t>
+            </w:r>
+            <w:r>
+              <w:rPr>
+                <w:rFonts w:ascii="Arial" w:hAnsi="Arial" w:eastAsia="Arial" w:cs="Arial"/>
+                <w:noProof w:val="0"/>
+                <w:sz w:val="22"/>
+                <w:szCs w:val="22"/>
+                <w:lang w:val="en-US"/>
+              </w:rPr>
+              <w:t>l</w:t>
+            </w:r>
+            <w:r>
+              <w:rPr>
+                <w:rFonts w:ascii="Arial" w:hAnsi="Arial" w:eastAsia="Arial" w:cs="Arial"/>
+                <w:noProof w:val="0"/>
+                <w:sz w:val="22"/>
+                <w:szCs w:val="22"/>
+                <w:lang w:val="en-US"/>
+              </w:rPr>
+              <w:t xml:space="preserve"> durante o desenvolvimento do projeto, permitindo configurar ambientes isolados para </w:t>
+            </w:r>
+            <w:r>
+              <w:rPr>
+                <w:rFonts w:ascii="Arial" w:hAnsi="Arial" w:eastAsia="Arial" w:cs="Arial"/>
+                <w:noProof w:val="0"/>
+                <w:sz w:val="22"/>
+                <w:szCs w:val="22"/>
+                <w:lang w:val="en-US"/>
+              </w:rPr>
+              <w:t>hospedar o banco de dados.</w:t>
             </w:r>
           </w:p>
         </w:tc>
@@ -4237,7 +4248,7 @@
                 <w:szCs w:val="22"/>
                 <w:lang w:val="en-US"/>
               </w:rPr>
-              <w:t>Plataforma utilizada para versionamento do código-fonte, armazenamento do projeto em nuvem e controle das alterações realizadas durante o desenvolvimento.</w:t>
+              <w:t>Plataforma utilizada para versionamento do código, armazenamento do projeto e controle das alterações realizadas durante o desenvolvimento.</w:t>
             </w:r>
           </w:p>
         </w:tc>
@@ -4309,6 +4320,237 @@
       <w:pPr>
         <w:pStyle w:val="Normal"/>
         <w:jc w:val="left"/>
+      </w:pPr>
+    </w:p>
+    <w:p>
+      <w:pPr>
+        <w:pStyle w:val="Heading1"/>
+      </w:pPr>
+      <w:r>
+        <w:rPr>
+          <w:lang w:val="en-US"/>
+        </w:rPr>
+        <w:t>Bibliografia</w:t>
+      </w:r>
+    </w:p>
+    <w:p>
+      <w:pPr>
+        <w:pStyle w:val="Normal"/>
+        <w:rPr>
+          <w:lang w:val="en-US"/>
+        </w:rPr>
+      </w:pPr>
+    </w:p>
+    <w:p>
+      <w:pPr>
+        <w:pStyle w:val="Normal"/>
+        <w:rPr>
+          <w:lang w:val="en-US"/>
+        </w:rPr>
+      </w:pPr>
+      <w:r>
+        <w:rPr>
+          <w:lang w:val="en-US"/>
+        </w:rPr>
+        <w:t xml:space="preserve">Site </w:t>
+      </w:r>
+      <w:r>
+        <w:rPr>
+          <w:lang w:val="en-US"/>
+        </w:rPr>
+        <w:t>oficial</w:t>
+      </w:r>
+      <w:r>
+        <w:rPr>
+          <w:lang w:val="en-US"/>
+        </w:rPr>
+        <w:t xml:space="preserve"> do Rocket League:</w:t>
+      </w:r>
+    </w:p>
+    <w:p>
+      <w:pPr>
+        <w:pStyle w:val="Normal"/>
+        <w:rPr>
+          <w:lang w:val="en-US"/>
+        </w:rPr>
+      </w:pPr>
+      <w:hyperlink r:id="Ra7eadd3292c34da9">
+        <w:r>
+          <w:rPr>
+            <w:rStyle w:val="Hyperlink"/>
+            <w:lang w:val="en-US"/>
+          </w:rPr>
+          <w:t>https://www.rocketleague.com</w:t>
+        </w:r>
+      </w:hyperlink>
+    </w:p>
+    <w:p>
+      <w:pPr>
+        <w:pStyle w:val="Normal"/>
+        <w:rPr>
+          <w:lang w:val="en-US"/>
+        </w:rPr>
+      </w:pPr>
+    </w:p>
+    <w:p>
+      <w:pPr>
+        <w:pStyle w:val="Normal"/>
+        <w:rPr>
+          <w:lang w:val="en-US"/>
+        </w:rPr>
+      </w:pPr>
+      <w:r>
+        <w:rPr>
+          <w:lang w:val="en-US"/>
+        </w:rPr>
+        <w:t>Rocket League Wiki:</w:t>
+      </w:r>
+    </w:p>
+    <w:p>
+      <w:pPr>
+        <w:pStyle w:val="Normal"/>
+        <w:rPr>
+          <w:lang w:val="en-US"/>
+        </w:rPr>
+      </w:pPr>
+      <w:hyperlink r:id="R208d934dd7c44a11">
+        <w:r>
+          <w:rPr>
+            <w:rStyle w:val="Hyperlink"/>
+            <w:lang w:val="en-US"/>
+          </w:rPr>
+          <w:t>https://rocketleague.fandom.com/wiki/Rocket_League_Wiki</w:t>
+        </w:r>
+      </w:hyperlink>
+    </w:p>
+    <w:p>
+      <w:pPr>
+        <w:pStyle w:val="Normal"/>
+        <w:rPr>
+          <w:lang w:val="en-US"/>
+        </w:rPr>
+      </w:pPr>
+    </w:p>
+    <w:p>
+      <w:pPr>
+        <w:pStyle w:val="Normal"/>
+        <w:rPr>
+          <w:lang w:val="en-US"/>
+        </w:rPr>
+      </w:pPr>
+      <w:r>
+        <w:rPr>
+          <w:lang w:val="en-US"/>
+        </w:rPr>
+        <w:t>Rocket League Liquipedia:</w:t>
+      </w:r>
+    </w:p>
+    <w:p>
+      <w:pPr>
+        <w:pStyle w:val="Normal"/>
+        <w:rPr>
+          <w:lang w:val="en-US"/>
+        </w:rPr>
+      </w:pPr>
+      <w:hyperlink r:id="R6aea3d1b0a4640d6">
+        <w:r>
+          <w:rPr>
+            <w:rStyle w:val="Hyperlink"/>
+            <w:lang w:val="en-US"/>
+          </w:rPr>
+          <w:t>https://liquipedia.net/rocketleague/Main_Page</w:t>
+        </w:r>
+      </w:hyperlink>
+    </w:p>
+    <w:p>
+      <w:pPr>
+        <w:pStyle w:val="Normal"/>
+        <w:rPr>
+          <w:lang w:val="en-US"/>
+        </w:rPr>
+      </w:pPr>
+    </w:p>
+    <w:p>
+      <w:pPr>
+        <w:pStyle w:val="Normal"/>
+        <w:rPr>
+          <w:lang w:val="en-US"/>
+        </w:rPr>
+      </w:pPr>
+      <w:r>
+        <w:rPr>
+          <w:lang w:val="en-US"/>
+        </w:rPr>
+        <w:t>Firewall154 (YouTube):</w:t>
+      </w:r>
+    </w:p>
+    <w:p>
+      <w:pPr>
+        <w:pStyle w:val="Normal"/>
+        <w:rPr>
+          <w:lang w:val="en-US"/>
+        </w:rPr>
+      </w:pPr>
+      <w:hyperlink r:id="Ree0fcec279114e49">
+        <w:r>
+          <w:rPr>
+            <w:rStyle w:val="Hyperlink"/>
+            <w:lang w:val="en-US"/>
+          </w:rPr>
+          <w:t>https://www.youtube.com/@Firewall154</w:t>
+        </w:r>
+      </w:hyperlink>
+    </w:p>
+    <w:p>
+      <w:pPr>
+        <w:pStyle w:val="Normal"/>
+        <w:rPr>
+          <w:lang w:val="en-US"/>
+        </w:rPr>
+      </w:pPr>
+    </w:p>
+    <w:p>
+      <w:pPr>
+        <w:pStyle w:val="Normal"/>
+        <w:rPr>
+          <w:lang w:val="en-US"/>
+        </w:rPr>
+      </w:pPr>
+      <w:r>
+        <w:rPr>
+          <w:lang w:val="en-US"/>
+        </w:rPr>
+        <w:t xml:space="preserve">ODS 4: </w:t>
+      </w:r>
+    </w:p>
+    <w:p>
+      <w:pPr>
+        <w:pStyle w:val="Normal"/>
+        <w:rPr>
+          <w:lang w:val="en-US"/>
+        </w:rPr>
+      </w:pPr>
+      <w:hyperlink r:id="R4b765f3c14cf4221">
+        <w:r>
+          <w:rPr>
+            <w:rStyle w:val="Hyperlink"/>
+            <w:lang w:val="en-US"/>
+          </w:rPr>
+          <w:t>https://brasil.un.org/pt-br/sdgs/4</w:t>
+        </w:r>
+      </w:hyperlink>
+    </w:p>
+    <w:p>
+      <w:pPr>
+        <w:pStyle w:val="Normal"/>
+        <w:rPr>
+          <w:lang w:val="en-US"/>
+        </w:rPr>
+      </w:pPr>
+    </w:p>
+    <w:p>
+      <w:pPr>
+        <w:pStyle w:val="Normal"/>
       </w:pPr>
     </w:p>
     <w:sectPr>

</xml_diff>